<commit_message>
Update Amex Product Resume
</commit_message>
<xml_diff>
--- a/resume/amex/Harshit_Jindal_Product.docx
+++ b/resume/amex/Harshit_Jindal_Product.docx
@@ -10,14 +10,14 @@
         <w:tblLook w:val="01E0" w:firstRow="1" w:lastRow="1" w:firstColumn="1" w:lastColumn="1" w:noHBand="0" w:noVBand="0"/>
       </w:tblPr>
       <w:tblGrid>
-        <w:gridCol w:w="2068"/>
-        <w:gridCol w:w="736"/>
-        <w:gridCol w:w="565"/>
-        <w:gridCol w:w="3402"/>
-        <w:gridCol w:w="142"/>
-        <w:gridCol w:w="567"/>
-        <w:gridCol w:w="700"/>
-        <w:gridCol w:w="2275"/>
+        <w:gridCol w:w="2108"/>
+        <w:gridCol w:w="750"/>
+        <w:gridCol w:w="576"/>
+        <w:gridCol w:w="3469"/>
+        <w:gridCol w:w="145"/>
+        <w:gridCol w:w="578"/>
+        <w:gridCol w:w="714"/>
+        <w:gridCol w:w="2320"/>
       </w:tblGrid>
       <w:tr>
         <w:trPr>
@@ -69,7 +69,7 @@
                 <w:sz w:val="20"/>
                 <w:szCs w:val="20"/>
               </w:rPr>
-              <w:t>Software Engineer</w:t>
+              <w:t>Product Owner</w:t>
             </w:r>
           </w:p>
         </w:tc>
@@ -125,7 +125,7 @@
               <w:fldChar w:fldCharType="begin"/>
             </w:r>
             <w:r>
-              <w:instrText>HYPERLINK "mailto:contact@harshitjindal.com" \o "contact@harshitjindal.com"</w:instrText>
+              <w:instrText>HYPERLINK "mailto:Harshit.Jindal1@aexp.com" \o "contact@harshitjindal.com"</w:instrText>
             </w:r>
             <w:r>
               <w:fldChar w:fldCharType="separate"/>
@@ -137,7 +137,7 @@
                 <w:sz w:val="20"/>
                 <w:szCs w:val="20"/>
               </w:rPr>
-              <w:t>contact@harshitjindal.com</w:t>
+              <w:t>Harshit.Jindal1@aexp.com</w:t>
             </w:r>
             <w:r>
               <w:rPr>
@@ -171,6 +171,50 @@
             <w:shd w:val="clear" w:color="auto" w:fill="auto"/>
             <w:vAlign w:val="bottom"/>
           </w:tcPr>
+          <w:p>
+            <w:pPr>
+              <w:jc w:val="center"/>
+              <w:rPr>
+                <w:rFonts w:ascii="Calibri" w:hAnsi="Calibri" w:cs="Calibri"/>
+                <w:sz w:val="18"/>
+                <w:szCs w:val="18"/>
+              </w:rPr>
+            </w:pPr>
+          </w:p>
+          <w:p>
+            <w:pPr>
+              <w:jc w:val="both"/>
+              <w:rPr>
+                <w:rFonts w:ascii="Calibri" w:hAnsi="Calibri" w:cs="Calibri"/>
+                <w:sz w:val="18"/>
+                <w:szCs w:val="18"/>
+              </w:rPr>
+            </w:pPr>
+            <w:r>
+              <w:rPr>
+                <w:rFonts w:ascii="Calibri" w:hAnsi="Calibri" w:cs="Calibri"/>
+                <w:sz w:val="18"/>
+                <w:szCs w:val="18"/>
+              </w:rPr>
+              <w:t>Product Owner with proven experience leading large-scale regulatory initiatives and platform migrations at American Express</w:t>
+            </w:r>
+            <w:r>
+              <w:rPr>
+                <w:rFonts w:ascii="Calibri" w:hAnsi="Calibri" w:cs="Calibri"/>
+                <w:sz w:val="18"/>
+                <w:szCs w:val="18"/>
+              </w:rPr>
+              <w:t>, with a s</w:t>
+            </w:r>
+            <w:r>
+              <w:rPr>
+                <w:rFonts w:ascii="Calibri" w:hAnsi="Calibri" w:cs="Calibri"/>
+                <w:sz w:val="18"/>
+                <w:szCs w:val="18"/>
+              </w:rPr>
+              <w:t>trong ownership of product backlog, sprint planning, and end-to-end delivery, complemented by a solid background in software engineering.</w:t>
+            </w:r>
+          </w:p>
           <w:p>
             <w:pPr>
               <w:jc w:val="center"/>
@@ -242,7 +286,6 @@
                 <w:szCs w:val="20"/>
               </w:rPr>
             </w:pPr>
-            <w:bookmarkStart w:id="2" w:name="_Hlk144189404"/>
             <w:r>
               <w:rPr>
                 <w:rFonts w:ascii="Calibri" w:hAnsi="Calibri" w:cs="Calibri"/>
@@ -370,153 +413,92 @@
                 <w:szCs w:val="20"/>
               </w:rPr>
             </w:pPr>
+            <w:bookmarkStart w:id="2" w:name="_Hlk152521493"/>
             <w:bookmarkStart w:id="3" w:name="_Hlk144188629"/>
             <w:bookmarkStart w:id="4" w:name="_Hlk152520120"/>
-            <w:bookmarkStart w:id="5" w:name="_Hlk152521493"/>
-            <w:r>
-              <w:rPr>
-                <w:rFonts w:ascii="Calibri" w:hAnsi="Calibri" w:cs="Calibri"/>
-                <w:sz w:val="20"/>
-                <w:szCs w:val="20"/>
-              </w:rPr>
-              <w:t>Backend s</w:t>
-            </w:r>
-            <w:r>
-              <w:rPr>
-                <w:rFonts w:ascii="Calibri" w:hAnsi="Calibri" w:cs="Calibri"/>
-                <w:sz w:val="20"/>
-                <w:szCs w:val="20"/>
-              </w:rPr>
-              <w:t>oftware engineer</w:t>
-            </w:r>
-            <w:r>
-              <w:rPr>
-                <w:rFonts w:ascii="Calibri" w:hAnsi="Calibri" w:cs="Calibri"/>
-                <w:sz w:val="20"/>
-                <w:szCs w:val="20"/>
-              </w:rPr>
-              <w:t xml:space="preserve"> </w:t>
-            </w:r>
-            <w:bookmarkEnd w:id="3"/>
-            <w:r>
-              <w:rPr>
-                <w:rFonts w:ascii="Calibri" w:hAnsi="Calibri" w:cs="Calibri"/>
-                <w:sz w:val="20"/>
-                <w:szCs w:val="20"/>
-              </w:rPr>
-              <w:t>for</w:t>
-            </w:r>
-            <w:r>
-              <w:rPr>
-                <w:rFonts w:ascii="Calibri" w:hAnsi="Calibri" w:cs="Calibri"/>
-                <w:sz w:val="20"/>
-                <w:szCs w:val="20"/>
-              </w:rPr>
-              <w:t xml:space="preserve"> </w:t>
-            </w:r>
-            <w:r>
-              <w:rPr>
-                <w:rFonts w:ascii="Calibri" w:hAnsi="Calibri" w:cs="Calibri"/>
-                <w:sz w:val="20"/>
-                <w:szCs w:val="20"/>
-              </w:rPr>
-              <w:t>a critical</w:t>
-            </w:r>
-            <w:r>
-              <w:rPr>
-                <w:rFonts w:ascii="Calibri" w:hAnsi="Calibri" w:cs="Calibri"/>
-                <w:sz w:val="20"/>
-                <w:szCs w:val="20"/>
-              </w:rPr>
-              <w:t xml:space="preserve"> </w:t>
-            </w:r>
-            <w:r>
-              <w:rPr>
-                <w:rFonts w:ascii="Calibri" w:hAnsi="Calibri" w:cs="Calibri"/>
-                <w:sz w:val="20"/>
-                <w:szCs w:val="20"/>
-              </w:rPr>
-              <w:t>web</w:t>
-            </w:r>
-            <w:r>
-              <w:rPr>
-                <w:rFonts w:ascii="Calibri" w:hAnsi="Calibri" w:cs="Calibri"/>
-                <w:sz w:val="20"/>
-                <w:szCs w:val="20"/>
-              </w:rPr>
-              <w:t xml:space="preserve"> </w:t>
-            </w:r>
-            <w:r>
-              <w:rPr>
-                <w:rFonts w:ascii="Calibri" w:hAnsi="Calibri" w:cs="Calibri"/>
-                <w:sz w:val="20"/>
-                <w:szCs w:val="20"/>
-              </w:rPr>
-              <w:t>application</w:t>
-            </w:r>
-            <w:r>
-              <w:rPr>
-                <w:rFonts w:ascii="Calibri" w:hAnsi="Calibri" w:cs="Calibri"/>
-                <w:sz w:val="20"/>
-                <w:szCs w:val="20"/>
-              </w:rPr>
-              <w:t xml:space="preserve"> </w:t>
-            </w:r>
-            <w:r>
-              <w:rPr>
-                <w:rFonts w:ascii="Calibri" w:hAnsi="Calibri" w:cs="Calibri"/>
-                <w:sz w:val="20"/>
-                <w:szCs w:val="20"/>
-              </w:rPr>
-              <w:t>used by data scientists for</w:t>
-            </w:r>
-            <w:r>
-              <w:rPr>
-                <w:rFonts w:ascii="Calibri" w:hAnsi="Calibri" w:cs="Calibri"/>
-                <w:sz w:val="20"/>
-                <w:szCs w:val="20"/>
-              </w:rPr>
-              <w:t xml:space="preserve"> </w:t>
-            </w:r>
-            <w:r>
-              <w:rPr>
-                <w:rFonts w:ascii="Calibri" w:hAnsi="Calibri" w:cs="Calibri"/>
-                <w:sz w:val="20"/>
-                <w:szCs w:val="20"/>
-              </w:rPr>
-              <w:t>the development</w:t>
-            </w:r>
-            <w:r>
-              <w:rPr>
-                <w:rFonts w:ascii="Calibri" w:hAnsi="Calibri" w:cs="Calibri"/>
-                <w:sz w:val="20"/>
-                <w:szCs w:val="20"/>
-              </w:rPr>
-              <w:t xml:space="preserve">, </w:t>
-            </w:r>
-            <w:r>
-              <w:rPr>
-                <w:rFonts w:ascii="Calibri" w:hAnsi="Calibri" w:cs="Calibri"/>
-                <w:sz w:val="20"/>
-                <w:szCs w:val="20"/>
-              </w:rPr>
-              <w:t>testing,</w:t>
-            </w:r>
-            <w:r>
-              <w:rPr>
-                <w:rFonts w:ascii="Calibri" w:hAnsi="Calibri" w:cs="Calibri"/>
-                <w:sz w:val="20"/>
-                <w:szCs w:val="20"/>
-              </w:rPr>
-              <w:t xml:space="preserve"> governance,</w:t>
-            </w:r>
-            <w:r>
-              <w:rPr>
-                <w:rFonts w:ascii="Calibri" w:hAnsi="Calibri" w:cs="Calibri"/>
-                <w:sz w:val="20"/>
-                <w:szCs w:val="20"/>
-              </w:rPr>
-              <w:t xml:space="preserve"> and deployment of Machine Learning (ML) models at Amex.</w:t>
+            <w:r>
+              <w:rPr>
+                <w:rFonts w:ascii="Calibri" w:hAnsi="Calibri" w:cs="Calibri"/>
+                <w:b/>
+                <w:bCs/>
+                <w:sz w:val="20"/>
+                <w:szCs w:val="20"/>
+              </w:rPr>
+              <w:t>Product Owner</w:t>
+            </w:r>
+            <w:r>
+              <w:rPr>
+                <w:rFonts w:ascii="Calibri" w:hAnsi="Calibri" w:cs="Calibri"/>
+                <w:sz w:val="20"/>
+                <w:szCs w:val="20"/>
+              </w:rPr>
+              <w:t xml:space="preserve"> for </w:t>
+            </w:r>
+            <w:r>
+              <w:rPr>
+                <w:rFonts w:ascii="Calibri" w:hAnsi="Calibri" w:cs="Calibri"/>
+                <w:sz w:val="20"/>
+                <w:szCs w:val="20"/>
+              </w:rPr>
+              <w:t xml:space="preserve">the </w:t>
+            </w:r>
+            <w:r>
+              <w:rPr>
+                <w:rFonts w:ascii="Calibri" w:hAnsi="Calibri" w:cs="Calibri"/>
+                <w:b/>
+                <w:bCs/>
+                <w:sz w:val="20"/>
+                <w:szCs w:val="20"/>
+              </w:rPr>
+              <w:t>Outbound Bureau Reporting</w:t>
+            </w:r>
+            <w:r>
+              <w:rPr>
+                <w:rFonts w:ascii="Calibri" w:hAnsi="Calibri" w:cs="Calibri"/>
+                <w:sz w:val="20"/>
+                <w:szCs w:val="20"/>
+              </w:rPr>
+              <w:t xml:space="preserve"> team</w:t>
+            </w:r>
+            <w:r>
+              <w:rPr>
+                <w:rFonts w:ascii="Calibri" w:hAnsi="Calibri" w:cs="Calibri"/>
+                <w:sz w:val="20"/>
+                <w:szCs w:val="20"/>
+              </w:rPr>
+              <w:t xml:space="preserve">, owning backlog, sprint planning, and end-to-end </w:t>
+            </w:r>
+            <w:r>
+              <w:rPr>
+                <w:rFonts w:ascii="Calibri" w:hAnsi="Calibri" w:cs="Calibri"/>
+                <w:sz w:val="20"/>
+                <w:szCs w:val="20"/>
+              </w:rPr>
+              <w:t xml:space="preserve">product </w:t>
+            </w:r>
+            <w:r>
+              <w:rPr>
+                <w:rFonts w:ascii="Calibri" w:hAnsi="Calibri" w:cs="Calibri"/>
+                <w:sz w:val="20"/>
+                <w:szCs w:val="20"/>
+              </w:rPr>
+              <w:t xml:space="preserve">delivery across regulatory and business-critical initiatives spanning </w:t>
+            </w:r>
+            <w:r>
+              <w:rPr>
+                <w:rFonts w:ascii="Calibri" w:hAnsi="Calibri" w:cs="Calibri"/>
+                <w:sz w:val="20"/>
+                <w:szCs w:val="20"/>
+              </w:rPr>
+              <w:t>global portfolios</w:t>
+            </w:r>
+            <w:r>
+              <w:rPr>
+                <w:rFonts w:ascii="Calibri" w:hAnsi="Calibri" w:cs="Calibri"/>
+                <w:sz w:val="20"/>
+                <w:szCs w:val="20"/>
+              </w:rPr>
+              <w:t>.</w:t>
             </w:r>
           </w:p>
           <w:p>
@@ -536,201 +518,158 @@
                 <w:szCs w:val="20"/>
               </w:rPr>
             </w:pPr>
-            <w:bookmarkStart w:id="6" w:name="_Hlk152516239"/>
-            <w:bookmarkStart w:id="7" w:name="_Hlk152151040"/>
-            <w:bookmarkStart w:id="8" w:name="_Hlk152520106"/>
-            <w:bookmarkEnd w:id="4"/>
-            <w:r>
-              <w:rPr>
-                <w:rFonts w:ascii="Calibri" w:hAnsi="Calibri" w:cs="Calibri"/>
-                <w:sz w:val="20"/>
-                <w:szCs w:val="20"/>
-              </w:rPr>
-              <w:t>Led</w:t>
-            </w:r>
-            <w:r>
-              <w:rPr>
-                <w:rFonts w:ascii="Calibri" w:hAnsi="Calibri" w:cs="Calibri"/>
-                <w:sz w:val="20"/>
-                <w:szCs w:val="20"/>
-              </w:rPr>
-              <w:t xml:space="preserve"> a team</w:t>
-            </w:r>
-            <w:r>
-              <w:rPr>
-                <w:rFonts w:ascii="Calibri" w:hAnsi="Calibri" w:cs="Calibri"/>
-                <w:sz w:val="20"/>
-                <w:szCs w:val="20"/>
-              </w:rPr>
-              <w:t xml:space="preserve"> of four</w:t>
-            </w:r>
-            <w:r>
-              <w:rPr>
-                <w:rFonts w:ascii="Calibri" w:hAnsi="Calibri" w:cs="Calibri"/>
-                <w:sz w:val="20"/>
-                <w:szCs w:val="20"/>
-              </w:rPr>
-              <w:t xml:space="preserve"> to build</w:t>
-            </w:r>
-            <w:r>
-              <w:rPr>
-                <w:rFonts w:ascii="Calibri" w:hAnsi="Calibri" w:cs="Calibri"/>
-                <w:sz w:val="20"/>
-                <w:szCs w:val="20"/>
-              </w:rPr>
-              <w:t xml:space="preserve"> and own</w:t>
-            </w:r>
-            <w:r>
-              <w:rPr>
-                <w:rFonts w:ascii="Calibri" w:hAnsi="Calibri" w:cs="Calibri"/>
-                <w:sz w:val="20"/>
-                <w:szCs w:val="20"/>
-              </w:rPr>
-              <w:t xml:space="preserve"> </w:t>
-            </w:r>
-            <w:r>
-              <w:rPr>
-                <w:rFonts w:ascii="Calibri" w:hAnsi="Calibri" w:cs="Calibri"/>
-                <w:sz w:val="20"/>
-                <w:szCs w:val="20"/>
-              </w:rPr>
-              <w:t xml:space="preserve">a </w:t>
-            </w:r>
-            <w:r>
-              <w:rPr>
-                <w:rFonts w:ascii="Calibri" w:hAnsi="Calibri" w:cs="Calibri"/>
-                <w:sz w:val="20"/>
-                <w:szCs w:val="20"/>
-              </w:rPr>
-              <w:t>pivotal pipeline</w:t>
-            </w:r>
-            <w:r>
-              <w:rPr>
-                <w:rFonts w:ascii="Calibri" w:hAnsi="Calibri" w:cs="Calibri"/>
-                <w:sz w:val="20"/>
-                <w:szCs w:val="20"/>
-              </w:rPr>
-              <w:t xml:space="preserve"> </w:t>
-            </w:r>
-            <w:r>
-              <w:rPr>
-                <w:rFonts w:ascii="Calibri" w:hAnsi="Calibri" w:cs="Calibri"/>
-                <w:sz w:val="20"/>
-                <w:szCs w:val="20"/>
-              </w:rPr>
-              <w:t>that bridges</w:t>
-            </w:r>
-            <w:r>
-              <w:rPr>
-                <w:rFonts w:ascii="Calibri" w:hAnsi="Calibri" w:cs="Calibri"/>
-                <w:sz w:val="20"/>
-                <w:szCs w:val="20"/>
-              </w:rPr>
-              <w:t xml:space="preserve"> </w:t>
-            </w:r>
-            <w:r>
-              <w:rPr>
-                <w:rFonts w:ascii="Calibri" w:hAnsi="Calibri" w:cs="Calibri"/>
-                <w:sz w:val="20"/>
-                <w:szCs w:val="20"/>
-              </w:rPr>
-              <w:t xml:space="preserve">the gap between the </w:t>
-            </w:r>
-            <w:r>
-              <w:rPr>
-                <w:rFonts w:ascii="Calibri" w:hAnsi="Calibri" w:cs="Calibri"/>
-                <w:sz w:val="20"/>
-                <w:szCs w:val="20"/>
-              </w:rPr>
-              <w:t>data scientists</w:t>
-            </w:r>
-            <w:r>
-              <w:rPr>
-                <w:rFonts w:ascii="Calibri" w:hAnsi="Calibri" w:cs="Calibri"/>
-                <w:sz w:val="20"/>
-                <w:szCs w:val="20"/>
-              </w:rPr>
-              <w:t xml:space="preserve"> and the </w:t>
-            </w:r>
-            <w:r>
-              <w:rPr>
-                <w:rFonts w:ascii="Calibri" w:hAnsi="Calibri" w:cs="Calibri"/>
-                <w:sz w:val="20"/>
-                <w:szCs w:val="20"/>
-              </w:rPr>
-              <w:t xml:space="preserve">real-time </w:t>
-            </w:r>
-            <w:r>
-              <w:rPr>
-                <w:rFonts w:ascii="Calibri" w:hAnsi="Calibri" w:cs="Calibri"/>
-                <w:sz w:val="20"/>
-                <w:szCs w:val="20"/>
-              </w:rPr>
-              <w:t>execut</w:t>
-            </w:r>
-            <w:r>
-              <w:rPr>
-                <w:rFonts w:ascii="Calibri" w:hAnsi="Calibri" w:cs="Calibri"/>
-                <w:sz w:val="20"/>
-                <w:szCs w:val="20"/>
-              </w:rPr>
-              <w:t>ion platform</w:t>
-            </w:r>
-            <w:r>
-              <w:rPr>
-                <w:rFonts w:ascii="Calibri" w:hAnsi="Calibri" w:cs="Calibri"/>
-                <w:sz w:val="20"/>
-                <w:szCs w:val="20"/>
-              </w:rPr>
-              <w:t>,</w:t>
-            </w:r>
-            <w:r>
-              <w:rPr>
-                <w:rFonts w:ascii="Calibri" w:hAnsi="Calibri" w:cs="Calibri"/>
-                <w:sz w:val="20"/>
-                <w:szCs w:val="20"/>
-              </w:rPr>
-              <w:t xml:space="preserve"> </w:t>
-            </w:r>
-            <w:r>
-              <w:rPr>
-                <w:rFonts w:ascii="Calibri" w:hAnsi="Calibri" w:cs="Calibri"/>
-                <w:sz w:val="20"/>
-                <w:szCs w:val="20"/>
-              </w:rPr>
-              <w:t xml:space="preserve">directly </w:t>
-            </w:r>
-            <w:r>
-              <w:rPr>
-                <w:rFonts w:ascii="Calibri" w:hAnsi="Calibri" w:cs="Calibri"/>
-                <w:sz w:val="20"/>
-                <w:szCs w:val="20"/>
-              </w:rPr>
-              <w:t xml:space="preserve">supporting ML models with </w:t>
-            </w:r>
-            <w:r>
-              <w:rPr>
-                <w:rFonts w:ascii="Calibri" w:hAnsi="Calibri" w:cs="Calibri"/>
-                <w:sz w:val="20"/>
-                <w:szCs w:val="20"/>
-              </w:rPr>
-              <w:t xml:space="preserve">a </w:t>
-            </w:r>
-            <w:r>
-              <w:rPr>
-                <w:rFonts w:ascii="Calibri" w:hAnsi="Calibri" w:cs="Calibri"/>
-                <w:sz w:val="20"/>
-                <w:szCs w:val="20"/>
-              </w:rPr>
-              <w:t xml:space="preserve">combined </w:t>
-            </w:r>
-            <w:r>
-              <w:rPr>
-                <w:rFonts w:ascii="Calibri" w:hAnsi="Calibri" w:cs="Calibri"/>
-                <w:sz w:val="20"/>
-                <w:szCs w:val="20"/>
-              </w:rPr>
-              <w:t>pre-tax income benefit of over $50 million in 2023.</w:t>
+            <w:r>
+              <w:rPr>
+                <w:rFonts w:ascii="Calibri" w:hAnsi="Calibri" w:cs="Calibri"/>
+                <w:b/>
+                <w:bCs/>
+                <w:sz w:val="20"/>
+                <w:szCs w:val="20"/>
+              </w:rPr>
+              <w:t>L</w:t>
+            </w:r>
+            <w:r>
+              <w:rPr>
+                <w:rFonts w:ascii="Calibri" w:hAnsi="Calibri" w:cs="Calibri"/>
+                <w:b/>
+                <w:bCs/>
+                <w:sz w:val="20"/>
+                <w:szCs w:val="20"/>
+              </w:rPr>
+              <w:t>ed the Japan JICC POA Migration</w:t>
+            </w:r>
+            <w:r>
+              <w:rPr>
+                <w:rFonts w:ascii="Calibri" w:hAnsi="Calibri" w:cs="Calibri"/>
+                <w:sz w:val="20"/>
+                <w:szCs w:val="20"/>
+              </w:rPr>
+              <w:t xml:space="preserve"> from legacy mainframe (JCBIS) to Cornerstone</w:t>
+            </w:r>
+            <w:r>
+              <w:rPr>
+                <w:rFonts w:ascii="Calibri" w:hAnsi="Calibri" w:cs="Calibri"/>
+                <w:sz w:val="20"/>
+                <w:szCs w:val="20"/>
+              </w:rPr>
+              <w:t xml:space="preserve"> as </w:t>
+            </w:r>
+            <w:r>
+              <w:rPr>
+                <w:rFonts w:ascii="Calibri" w:hAnsi="Calibri" w:cs="Calibri"/>
+                <w:sz w:val="20"/>
+                <w:szCs w:val="20"/>
+              </w:rPr>
+              <w:t>one of the most complex bureau modernization programs:</w:t>
+            </w:r>
+          </w:p>
+          <w:p>
+            <w:pPr>
+              <w:numPr>
+                <w:ilvl w:val="1"/>
+                <w:numId w:val="1"/>
+              </w:numPr>
+              <w:tabs>
+                <w:tab w:val="clear" w:pos="1440"/>
+                <w:tab w:val="num" w:pos="720"/>
+              </w:tabs>
+              <w:ind w:left="990" w:hanging="270"/>
+              <w:jc w:val="both"/>
+              <w:rPr>
+                <w:rFonts w:ascii="Calibri" w:hAnsi="Calibri" w:cs="Calibri"/>
+                <w:sz w:val="20"/>
+                <w:szCs w:val="20"/>
+              </w:rPr>
+            </w:pPr>
+            <w:r>
+              <w:rPr>
+                <w:rFonts w:ascii="Calibri" w:hAnsi="Calibri" w:cs="Calibri"/>
+                <w:sz w:val="20"/>
+                <w:szCs w:val="20"/>
+              </w:rPr>
+              <w:t xml:space="preserve">Increased reporting volume by </w:t>
+            </w:r>
+            <w:r>
+              <w:rPr>
+                <w:rFonts w:ascii="Calibri" w:hAnsi="Calibri" w:cs="Calibri"/>
+                <w:b/>
+                <w:bCs/>
+                <w:sz w:val="20"/>
+                <w:szCs w:val="20"/>
+              </w:rPr>
+              <w:t>~30x (82K → 2.4M records/month)</w:t>
+            </w:r>
+            <w:r>
+              <w:rPr>
+                <w:rFonts w:ascii="Calibri" w:hAnsi="Calibri" w:cs="Calibri"/>
+                <w:sz w:val="20"/>
+                <w:szCs w:val="20"/>
+              </w:rPr>
+              <w:t xml:space="preserve"> via comprehensive reporting</w:t>
+            </w:r>
+          </w:p>
+          <w:p>
+            <w:pPr>
+              <w:numPr>
+                <w:ilvl w:val="1"/>
+                <w:numId w:val="1"/>
+              </w:numPr>
+              <w:tabs>
+                <w:tab w:val="clear" w:pos="1440"/>
+                <w:tab w:val="num" w:pos="720"/>
+              </w:tabs>
+              <w:ind w:left="990" w:hanging="270"/>
+              <w:jc w:val="both"/>
+              <w:rPr>
+                <w:rFonts w:ascii="Calibri" w:hAnsi="Calibri" w:cs="Calibri"/>
+                <w:sz w:val="20"/>
+                <w:szCs w:val="20"/>
+              </w:rPr>
+            </w:pPr>
+            <w:r>
+              <w:rPr>
+                <w:rFonts w:ascii="Calibri" w:hAnsi="Calibri" w:cs="Calibri"/>
+                <w:sz w:val="20"/>
+                <w:szCs w:val="20"/>
+              </w:rPr>
+              <w:t xml:space="preserve">Reduced bureau reject rates from </w:t>
+            </w:r>
+            <w:r>
+              <w:rPr>
+                <w:rFonts w:ascii="Calibri" w:hAnsi="Calibri" w:cs="Calibri"/>
+                <w:b/>
+                <w:bCs/>
+                <w:sz w:val="20"/>
+                <w:szCs w:val="20"/>
+              </w:rPr>
+              <w:t>16.6% → 0.41% (~15x improvement)</w:t>
+            </w:r>
+          </w:p>
+          <w:p>
+            <w:pPr>
+              <w:numPr>
+                <w:ilvl w:val="1"/>
+                <w:numId w:val="1"/>
+              </w:numPr>
+              <w:tabs>
+                <w:tab w:val="clear" w:pos="1440"/>
+                <w:tab w:val="num" w:pos="720"/>
+              </w:tabs>
+              <w:ind w:left="990" w:hanging="270"/>
+              <w:jc w:val="both"/>
+              <w:rPr>
+                <w:rFonts w:ascii="Calibri" w:hAnsi="Calibri" w:cs="Calibri"/>
+                <w:sz w:val="20"/>
+                <w:szCs w:val="20"/>
+              </w:rPr>
+            </w:pPr>
+            <w:r>
+              <w:rPr>
+                <w:rFonts w:ascii="Calibri" w:hAnsi="Calibri" w:cs="Calibri"/>
+                <w:sz w:val="20"/>
+                <w:szCs w:val="20"/>
+              </w:rPr>
+              <w:t>Closed 12 regulatory findings while improving transparency and reducing time-to-market for changes</w:t>
             </w:r>
           </w:p>
           <w:p>
@@ -750,197 +689,52 @@
                 <w:szCs w:val="20"/>
               </w:rPr>
             </w:pPr>
-            <w:bookmarkStart w:id="9" w:name="_Hlk152518940"/>
-            <w:bookmarkEnd w:id="6"/>
-            <w:r>
-              <w:rPr>
-                <w:rFonts w:ascii="Calibri" w:hAnsi="Calibri" w:cs="Calibri"/>
-                <w:sz w:val="20"/>
-                <w:szCs w:val="20"/>
-              </w:rPr>
-              <w:t>R</w:t>
-            </w:r>
-            <w:r>
-              <w:rPr>
-                <w:rFonts w:ascii="Calibri" w:hAnsi="Calibri" w:cs="Calibri"/>
-                <w:sz w:val="20"/>
-                <w:szCs w:val="20"/>
-              </w:rPr>
-              <w:t>efactor</w:t>
-            </w:r>
-            <w:r>
-              <w:rPr>
-                <w:rFonts w:ascii="Calibri" w:hAnsi="Calibri" w:cs="Calibri"/>
-                <w:sz w:val="20"/>
-                <w:szCs w:val="20"/>
-              </w:rPr>
-              <w:t>ed</w:t>
-            </w:r>
-            <w:r>
-              <w:rPr>
-                <w:rFonts w:ascii="Calibri" w:hAnsi="Calibri" w:cs="Calibri"/>
-                <w:sz w:val="20"/>
-                <w:szCs w:val="20"/>
-              </w:rPr>
-              <w:t xml:space="preserve"> </w:t>
-            </w:r>
-            <w:r>
-              <w:rPr>
-                <w:rFonts w:ascii="Calibri" w:hAnsi="Calibri" w:cs="Calibri"/>
-                <w:sz w:val="20"/>
-                <w:szCs w:val="20"/>
-              </w:rPr>
-              <w:t>the</w:t>
-            </w:r>
-            <w:r>
-              <w:rPr>
-                <w:rFonts w:ascii="Calibri" w:hAnsi="Calibri" w:cs="Calibri"/>
-                <w:sz w:val="20"/>
-                <w:szCs w:val="20"/>
-              </w:rPr>
-              <w:t xml:space="preserve"> </w:t>
-            </w:r>
-            <w:r>
-              <w:rPr>
-                <w:rFonts w:ascii="Calibri" w:hAnsi="Calibri" w:cs="Calibri"/>
-                <w:sz w:val="20"/>
-                <w:szCs w:val="20"/>
-              </w:rPr>
-              <w:t>monolith</w:t>
-            </w:r>
-            <w:r>
-              <w:rPr>
-                <w:rFonts w:ascii="Calibri" w:hAnsi="Calibri" w:cs="Calibri"/>
-                <w:sz w:val="20"/>
-                <w:szCs w:val="20"/>
-              </w:rPr>
-              <w:t>ic</w:t>
-            </w:r>
-            <w:r>
-              <w:rPr>
-                <w:rFonts w:ascii="Calibri" w:hAnsi="Calibri" w:cs="Calibri"/>
-                <w:sz w:val="20"/>
-                <w:szCs w:val="20"/>
-              </w:rPr>
-              <w:t xml:space="preserve"> app</w:t>
-            </w:r>
-            <w:r>
-              <w:rPr>
-                <w:rFonts w:ascii="Calibri" w:hAnsi="Calibri" w:cs="Calibri"/>
-                <w:sz w:val="20"/>
-                <w:szCs w:val="20"/>
-              </w:rPr>
-              <w:t>lication</w:t>
-            </w:r>
-            <w:r>
-              <w:rPr>
-                <w:rFonts w:ascii="Calibri" w:hAnsi="Calibri" w:cs="Calibri"/>
-                <w:sz w:val="20"/>
-                <w:szCs w:val="20"/>
-              </w:rPr>
-              <w:t xml:space="preserve"> </w:t>
-            </w:r>
-            <w:r>
-              <w:rPr>
-                <w:rFonts w:ascii="Calibri" w:hAnsi="Calibri" w:cs="Calibri"/>
-                <w:sz w:val="20"/>
-                <w:szCs w:val="20"/>
-              </w:rPr>
-              <w:t>into</w:t>
-            </w:r>
-            <w:r>
-              <w:rPr>
-                <w:rFonts w:ascii="Calibri" w:hAnsi="Calibri" w:cs="Calibri"/>
-                <w:sz w:val="20"/>
-                <w:szCs w:val="20"/>
-              </w:rPr>
-              <w:t xml:space="preserve"> individual services</w:t>
-            </w:r>
-            <w:r>
-              <w:rPr>
-                <w:rFonts w:ascii="Calibri" w:hAnsi="Calibri" w:cs="Calibri"/>
-                <w:sz w:val="20"/>
-                <w:szCs w:val="20"/>
-              </w:rPr>
-              <w:t xml:space="preserve">, </w:t>
-            </w:r>
-            <w:r>
-              <w:rPr>
-                <w:rFonts w:ascii="Calibri" w:hAnsi="Calibri" w:cs="Calibri"/>
-                <w:sz w:val="20"/>
-                <w:szCs w:val="20"/>
-              </w:rPr>
-              <w:t>reduc</w:t>
-            </w:r>
-            <w:r>
-              <w:rPr>
-                <w:rFonts w:ascii="Calibri" w:hAnsi="Calibri" w:cs="Calibri"/>
-                <w:sz w:val="20"/>
-                <w:szCs w:val="20"/>
-              </w:rPr>
-              <w:t>ing</w:t>
-            </w:r>
-            <w:r>
-              <w:rPr>
-                <w:rFonts w:ascii="Calibri" w:hAnsi="Calibri" w:cs="Calibri"/>
-                <w:sz w:val="20"/>
-                <w:szCs w:val="20"/>
-              </w:rPr>
-              <w:t xml:space="preserve"> code complexity</w:t>
-            </w:r>
-            <w:r>
-              <w:rPr>
-                <w:rFonts w:ascii="Calibri" w:hAnsi="Calibri" w:cs="Calibri"/>
-                <w:sz w:val="20"/>
-                <w:szCs w:val="20"/>
-              </w:rPr>
-              <w:t xml:space="preserve"> and </w:t>
-            </w:r>
-            <w:r>
-              <w:rPr>
-                <w:rFonts w:ascii="Calibri" w:hAnsi="Calibri" w:cs="Calibri"/>
-                <w:sz w:val="20"/>
-                <w:szCs w:val="20"/>
-              </w:rPr>
-              <w:t>improv</w:t>
-            </w:r>
-            <w:r>
-              <w:rPr>
-                <w:rFonts w:ascii="Calibri" w:hAnsi="Calibri" w:cs="Calibri"/>
-                <w:sz w:val="20"/>
-                <w:szCs w:val="20"/>
-              </w:rPr>
-              <w:t xml:space="preserve">ing </w:t>
-            </w:r>
-            <w:r>
-              <w:rPr>
-                <w:rFonts w:ascii="Calibri" w:hAnsi="Calibri" w:cs="Calibri"/>
-                <w:sz w:val="20"/>
-                <w:szCs w:val="20"/>
-              </w:rPr>
-              <w:t>maintainability</w:t>
-            </w:r>
-            <w:r>
-              <w:rPr>
-                <w:rFonts w:ascii="Calibri" w:hAnsi="Calibri" w:cs="Calibri"/>
-                <w:sz w:val="20"/>
-                <w:szCs w:val="20"/>
-              </w:rPr>
-              <w:t>.</w:t>
+            <w:r>
+              <w:rPr>
+                <w:rFonts w:ascii="Calibri" w:hAnsi="Calibri" w:cs="Calibri"/>
+                <w:b/>
+                <w:bCs/>
+                <w:sz w:val="20"/>
+                <w:szCs w:val="20"/>
+              </w:rPr>
+              <w:t>Spearheaded US Consumer POA Migration</w:t>
+            </w:r>
+            <w:r>
+              <w:rPr>
+                <w:rFonts w:ascii="Calibri" w:hAnsi="Calibri" w:cs="Calibri"/>
+                <w:sz w:val="20"/>
+                <w:szCs w:val="20"/>
+              </w:rPr>
+              <w:t>, transitioning from Mainframe</w:t>
+            </w:r>
+            <w:r>
+              <w:rPr>
+                <w:rFonts w:ascii="Calibri" w:hAnsi="Calibri" w:cs="Calibri"/>
+                <w:sz w:val="20"/>
+                <w:szCs w:val="20"/>
+              </w:rPr>
+              <w:t>/</w:t>
+            </w:r>
+            <w:r>
+              <w:rPr>
+                <w:rFonts w:ascii="Calibri" w:hAnsi="Calibri" w:cs="Calibri"/>
+                <w:sz w:val="20"/>
+                <w:szCs w:val="20"/>
+              </w:rPr>
+              <w:t>Informatica to Cornerstone:</w:t>
             </w:r>
           </w:p>
-          <w:bookmarkEnd w:id="7"/>
-          <w:bookmarkEnd w:id="9"/>
           <w:p>
             <w:pPr>
               <w:numPr>
-                <w:ilvl w:val="0"/>
+                <w:ilvl w:val="1"/>
                 <w:numId w:val="1"/>
               </w:numPr>
               <w:tabs>
-                <w:tab w:val="clear" w:pos="720"/>
+                <w:tab w:val="clear" w:pos="1440"/>
+                <w:tab w:val="num" w:pos="720"/>
               </w:tabs>
-              <w:ind w:left="252" w:hanging="180"/>
+              <w:ind w:left="990" w:hanging="270"/>
               <w:jc w:val="both"/>
               <w:rPr>
                 <w:rFonts w:ascii="Calibri" w:hAnsi="Calibri" w:cs="Calibri"/>
@@ -954,71 +748,167 @@
                 <w:sz w:val="20"/>
                 <w:szCs w:val="20"/>
               </w:rPr>
-              <w:t xml:space="preserve">Designed and developed the CI/CD pipeline for the application, </w:t>
-            </w:r>
-            <w:r>
-              <w:rPr>
-                <w:rFonts w:ascii="Calibri" w:hAnsi="Calibri" w:cs="Calibri"/>
-                <w:sz w:val="20"/>
-                <w:szCs w:val="20"/>
-              </w:rPr>
-              <w:t>eliminat</w:t>
-            </w:r>
-            <w:r>
-              <w:rPr>
-                <w:rFonts w:ascii="Calibri" w:hAnsi="Calibri" w:cs="Calibri"/>
-                <w:sz w:val="20"/>
-                <w:szCs w:val="20"/>
-              </w:rPr>
-              <w:t>ing</w:t>
-            </w:r>
-            <w:r>
-              <w:rPr>
-                <w:rFonts w:ascii="Calibri" w:hAnsi="Calibri" w:cs="Calibri"/>
-                <w:sz w:val="20"/>
-                <w:szCs w:val="20"/>
-              </w:rPr>
-              <w:t xml:space="preserve"> manual errors and </w:t>
-            </w:r>
-            <w:r>
-              <w:rPr>
-                <w:rFonts w:ascii="Calibri" w:hAnsi="Calibri" w:cs="Calibri"/>
-                <w:sz w:val="20"/>
-                <w:szCs w:val="20"/>
-              </w:rPr>
-              <w:t>reducing</w:t>
-            </w:r>
-            <w:r>
-              <w:rPr>
-                <w:rFonts w:ascii="Calibri" w:hAnsi="Calibri" w:cs="Calibri"/>
-                <w:sz w:val="20"/>
-                <w:szCs w:val="20"/>
-              </w:rPr>
-              <w:t xml:space="preserve"> the time-to-market for new features and bug fixes</w:t>
-            </w:r>
-            <w:r>
-              <w:rPr>
-                <w:rFonts w:ascii="Calibri" w:hAnsi="Calibri" w:cs="Calibri"/>
-                <w:sz w:val="20"/>
-                <w:szCs w:val="20"/>
-              </w:rPr>
-              <w:t>.</w:t>
-            </w:r>
-            <w:r>
-              <w:rPr>
-                <w:rFonts w:ascii="Calibri" w:hAnsi="Calibri" w:cs="Calibri"/>
-                <w:sz w:val="20"/>
-                <w:szCs w:val="20"/>
-              </w:rPr>
-              <w:t xml:space="preserve"> Additionally, coordinated with platform teams for infrastructure maintenance</w:t>
-            </w:r>
-            <w:r>
-              <w:rPr>
-                <w:rFonts w:ascii="Calibri" w:hAnsi="Calibri" w:cs="Calibri"/>
-                <w:sz w:val="20"/>
-                <w:szCs w:val="20"/>
-              </w:rPr>
-              <w:t xml:space="preserve"> and stability.</w:t>
+              <w:t xml:space="preserve">Closed </w:t>
+            </w:r>
+            <w:r>
+              <w:rPr>
+                <w:rFonts w:ascii="Calibri" w:hAnsi="Calibri" w:cs="Calibri"/>
+                <w:b/>
+                <w:bCs/>
+                <w:sz w:val="20"/>
+                <w:szCs w:val="20"/>
+              </w:rPr>
+              <w:t>4 GRO audit findings and 3 OREs</w:t>
+            </w:r>
+          </w:p>
+          <w:p>
+            <w:pPr>
+              <w:numPr>
+                <w:ilvl w:val="1"/>
+                <w:numId w:val="1"/>
+              </w:numPr>
+              <w:tabs>
+                <w:tab w:val="clear" w:pos="1440"/>
+                <w:tab w:val="num" w:pos="720"/>
+              </w:tabs>
+              <w:ind w:left="990" w:hanging="270"/>
+              <w:jc w:val="both"/>
+              <w:rPr>
+                <w:rFonts w:ascii="Calibri" w:hAnsi="Calibri" w:cs="Calibri"/>
+                <w:sz w:val="20"/>
+                <w:szCs w:val="20"/>
+              </w:rPr>
+            </w:pPr>
+            <w:r>
+              <w:rPr>
+                <w:rFonts w:ascii="Calibri" w:hAnsi="Calibri" w:cs="Calibri"/>
+                <w:sz w:val="20"/>
+                <w:szCs w:val="20"/>
+              </w:rPr>
+              <w:t xml:space="preserve">Enabled </w:t>
+            </w:r>
+            <w:r>
+              <w:rPr>
+                <w:rFonts w:ascii="Calibri" w:hAnsi="Calibri" w:cs="Calibri"/>
+                <w:sz w:val="20"/>
+                <w:szCs w:val="20"/>
+              </w:rPr>
+              <w:t>intracycle reporting</w:t>
+            </w:r>
+            <w:r>
+              <w:rPr>
+                <w:rFonts w:ascii="Calibri" w:hAnsi="Calibri" w:cs="Calibri"/>
+                <w:sz w:val="20"/>
+                <w:szCs w:val="20"/>
+              </w:rPr>
+              <w:t xml:space="preserve"> for fraud accounts</w:t>
+            </w:r>
+            <w:r>
+              <w:rPr>
+                <w:rFonts w:ascii="Calibri" w:hAnsi="Calibri" w:cs="Calibri"/>
+                <w:sz w:val="20"/>
+                <w:szCs w:val="20"/>
+              </w:rPr>
+              <w:t xml:space="preserve">, and </w:t>
+            </w:r>
+            <w:r>
+              <w:rPr>
+                <w:rFonts w:ascii="Calibri" w:hAnsi="Calibri" w:cs="Calibri"/>
+                <w:sz w:val="20"/>
+                <w:szCs w:val="20"/>
+              </w:rPr>
+              <w:t>multi</w:t>
+            </w:r>
+            <w:r>
+              <w:rPr>
+                <w:rFonts w:ascii="Calibri" w:hAnsi="Calibri" w:cs="Calibri"/>
+                <w:sz w:val="20"/>
+                <w:szCs w:val="20"/>
+              </w:rPr>
+              <w:t>-</w:t>
+            </w:r>
+            <w:r>
+              <w:rPr>
+                <w:rFonts w:ascii="Calibri" w:hAnsi="Calibri" w:cs="Calibri"/>
+                <w:sz w:val="20"/>
+                <w:szCs w:val="20"/>
+              </w:rPr>
+              <w:t>cycle processing</w:t>
+            </w:r>
+            <w:r>
+              <w:rPr>
+                <w:rFonts w:ascii="Calibri" w:hAnsi="Calibri" w:cs="Calibri"/>
+                <w:sz w:val="20"/>
+                <w:szCs w:val="20"/>
+              </w:rPr>
+              <w:t xml:space="preserve"> capabilities </w:t>
+            </w:r>
+            <w:r>
+              <w:rPr>
+                <w:rFonts w:ascii="Calibri" w:hAnsi="Calibri" w:cs="Calibri"/>
+                <w:sz w:val="20"/>
+                <w:szCs w:val="20"/>
+              </w:rPr>
+              <w:t>to reduce processing time by at</w:t>
+            </w:r>
+            <w:r>
+              <w:rPr>
+                <w:rFonts w:ascii="Calibri" w:hAnsi="Calibri" w:cs="Calibri"/>
+                <w:sz w:val="20"/>
+                <w:szCs w:val="20"/>
+              </w:rPr>
+              <w:t xml:space="preserve"> </w:t>
+            </w:r>
+            <w:r>
+              <w:rPr>
+                <w:rFonts w:ascii="Calibri" w:hAnsi="Calibri" w:cs="Calibri"/>
+                <w:sz w:val="20"/>
+                <w:szCs w:val="20"/>
+              </w:rPr>
+              <w:t>least 20 hours in case of backlogs</w:t>
+            </w:r>
+          </w:p>
+          <w:p>
+            <w:pPr>
+              <w:numPr>
+                <w:ilvl w:val="1"/>
+                <w:numId w:val="1"/>
+              </w:numPr>
+              <w:tabs>
+                <w:tab w:val="clear" w:pos="1440"/>
+                <w:tab w:val="num" w:pos="720"/>
+              </w:tabs>
+              <w:ind w:left="990" w:hanging="270"/>
+              <w:jc w:val="both"/>
+              <w:rPr>
+                <w:rFonts w:ascii="Calibri" w:hAnsi="Calibri" w:cs="Calibri"/>
+                <w:sz w:val="20"/>
+                <w:szCs w:val="20"/>
+              </w:rPr>
+            </w:pPr>
+            <w:r>
+              <w:rPr>
+                <w:rFonts w:ascii="Calibri" w:hAnsi="Calibri" w:cs="Calibri"/>
+                <w:sz w:val="20"/>
+                <w:szCs w:val="20"/>
+              </w:rPr>
+              <w:t xml:space="preserve">Established robust functional and technical control frameworks for governance </w:t>
+            </w:r>
+            <w:r>
+              <w:rPr>
+                <w:rFonts w:ascii="Calibri" w:hAnsi="Calibri" w:cs="Calibri"/>
+                <w:sz w:val="20"/>
+                <w:szCs w:val="20"/>
+              </w:rPr>
+              <w:t xml:space="preserve">and </w:t>
+            </w:r>
+            <w:r>
+              <w:rPr>
+                <w:rFonts w:ascii="Calibri" w:hAnsi="Calibri" w:cs="Calibri"/>
+                <w:sz w:val="20"/>
+                <w:szCs w:val="20"/>
+              </w:rPr>
+              <w:t>reporting accuracy</w:t>
             </w:r>
           </w:p>
           <w:p>
@@ -1041,18 +931,222 @@
             <w:r>
               <w:rPr>
                 <w:rFonts w:ascii="Calibri" w:hAnsi="Calibri" w:cs="Calibri"/>
-                <w:sz w:val="20"/>
-                <w:szCs w:val="20"/>
-              </w:rPr>
-              <w:t>Mentored</w:t>
-            </w:r>
-            <w:r>
-              <w:rPr>
-                <w:rFonts w:ascii="Calibri" w:hAnsi="Calibri" w:cs="Calibri"/>
-                <w:sz w:val="20"/>
-                <w:szCs w:val="20"/>
-              </w:rPr>
-              <w:t xml:space="preserve"> seven colleagues</w:t>
+                <w:b/>
+                <w:bCs/>
+                <w:sz w:val="20"/>
+                <w:szCs w:val="20"/>
+              </w:rPr>
+              <w:t>Launched India Fortnightly Consumer &amp; Commercial Reporting</w:t>
+            </w:r>
+            <w:r>
+              <w:rPr>
+                <w:rFonts w:ascii="Calibri" w:hAnsi="Calibri" w:cs="Calibri"/>
+                <w:sz w:val="20"/>
+                <w:szCs w:val="20"/>
+              </w:rPr>
+              <w:t xml:space="preserve"> (RBI regulatory requirement):</w:t>
+            </w:r>
+          </w:p>
+          <w:p>
+            <w:pPr>
+              <w:numPr>
+                <w:ilvl w:val="1"/>
+                <w:numId w:val="1"/>
+              </w:numPr>
+              <w:tabs>
+                <w:tab w:val="clear" w:pos="1440"/>
+                <w:tab w:val="num" w:pos="720"/>
+              </w:tabs>
+              <w:ind w:left="990" w:hanging="270"/>
+              <w:jc w:val="both"/>
+              <w:rPr>
+                <w:rFonts w:ascii="Calibri" w:hAnsi="Calibri" w:cs="Calibri"/>
+                <w:sz w:val="20"/>
+                <w:szCs w:val="20"/>
+              </w:rPr>
+            </w:pPr>
+            <w:r>
+              <w:rPr>
+                <w:rFonts w:ascii="Calibri" w:hAnsi="Calibri" w:cs="Calibri"/>
+                <w:sz w:val="20"/>
+                <w:szCs w:val="20"/>
+              </w:rPr>
+              <w:t xml:space="preserve">Doubled </w:t>
+            </w:r>
+            <w:r>
+              <w:rPr>
+                <w:rFonts w:ascii="Calibri" w:hAnsi="Calibri" w:cs="Calibri"/>
+                <w:sz w:val="20"/>
+                <w:szCs w:val="20"/>
+              </w:rPr>
+              <w:t xml:space="preserve">the </w:t>
+            </w:r>
+            <w:r>
+              <w:rPr>
+                <w:rFonts w:ascii="Calibri" w:hAnsi="Calibri" w:cs="Calibri"/>
+                <w:sz w:val="20"/>
+                <w:szCs w:val="20"/>
+              </w:rPr>
+              <w:t>reporting frequency, improving data freshness and decision-making accuracy</w:t>
+            </w:r>
+            <w:r>
+              <w:rPr>
+                <w:rFonts w:ascii="Calibri" w:hAnsi="Calibri" w:cs="Calibri"/>
+                <w:sz w:val="20"/>
+                <w:szCs w:val="20"/>
+              </w:rPr>
+              <w:t xml:space="preserve"> for </w:t>
+            </w:r>
+            <w:r>
+              <w:rPr>
+                <w:rFonts w:ascii="Calibri" w:hAnsi="Calibri" w:cs="Calibri"/>
+                <w:sz w:val="20"/>
+                <w:szCs w:val="20"/>
+              </w:rPr>
+              <w:t>f</w:t>
+            </w:r>
+            <w:r>
+              <w:rPr>
+                <w:rFonts w:ascii="Calibri" w:hAnsi="Calibri" w:cs="Calibri"/>
+                <w:sz w:val="20"/>
+                <w:szCs w:val="20"/>
+              </w:rPr>
+              <w:t xml:space="preserve">inancial </w:t>
+            </w:r>
+            <w:r>
+              <w:rPr>
+                <w:rFonts w:ascii="Calibri" w:hAnsi="Calibri" w:cs="Calibri"/>
+                <w:sz w:val="20"/>
+                <w:szCs w:val="20"/>
+              </w:rPr>
+              <w:t>i</w:t>
+            </w:r>
+            <w:r>
+              <w:rPr>
+                <w:rFonts w:ascii="Calibri" w:hAnsi="Calibri" w:cs="Calibri"/>
+                <w:sz w:val="20"/>
+                <w:szCs w:val="20"/>
+              </w:rPr>
+              <w:t xml:space="preserve">nsititutions </w:t>
+            </w:r>
+          </w:p>
+          <w:p>
+            <w:pPr>
+              <w:numPr>
+                <w:ilvl w:val="1"/>
+                <w:numId w:val="1"/>
+              </w:numPr>
+              <w:tabs>
+                <w:tab w:val="clear" w:pos="1440"/>
+                <w:tab w:val="num" w:pos="720"/>
+              </w:tabs>
+              <w:ind w:left="990" w:hanging="270"/>
+              <w:jc w:val="both"/>
+              <w:rPr>
+                <w:rFonts w:ascii="Calibri" w:hAnsi="Calibri" w:cs="Calibri"/>
+                <w:sz w:val="20"/>
+                <w:szCs w:val="20"/>
+              </w:rPr>
+            </w:pPr>
+            <w:r>
+              <w:rPr>
+                <w:rFonts w:ascii="Calibri" w:hAnsi="Calibri" w:cs="Calibri"/>
+                <w:sz w:val="20"/>
+                <w:szCs w:val="20"/>
+              </w:rPr>
+              <w:t xml:space="preserve">Delivered end-to-end as both </w:t>
+            </w:r>
+            <w:r>
+              <w:rPr>
+                <w:rFonts w:ascii="Calibri" w:hAnsi="Calibri" w:cs="Calibri"/>
+                <w:b/>
+                <w:bCs/>
+                <w:sz w:val="20"/>
+                <w:szCs w:val="20"/>
+              </w:rPr>
+              <w:t>Product Owner</w:t>
+            </w:r>
+            <w:r>
+              <w:rPr>
+                <w:rFonts w:ascii="Calibri" w:hAnsi="Calibri" w:cs="Calibri"/>
+                <w:sz w:val="20"/>
+                <w:szCs w:val="20"/>
+              </w:rPr>
+              <w:t xml:space="preserve"> and </w:t>
+            </w:r>
+            <w:r>
+              <w:rPr>
+                <w:rFonts w:ascii="Calibri" w:hAnsi="Calibri" w:cs="Calibri"/>
+                <w:b/>
+                <w:bCs/>
+                <w:sz w:val="20"/>
+                <w:szCs w:val="20"/>
+              </w:rPr>
+              <w:t>Product Developer</w:t>
+            </w:r>
+          </w:p>
+          <w:p>
+            <w:pPr>
+              <w:numPr>
+                <w:ilvl w:val="0"/>
+                <w:numId w:val="1"/>
+              </w:numPr>
+              <w:tabs>
+                <w:tab w:val="clear" w:pos="720"/>
+              </w:tabs>
+              <w:ind w:left="252" w:hanging="180"/>
+              <w:jc w:val="both"/>
+              <w:rPr>
+                <w:rFonts w:ascii="Calibri" w:hAnsi="Calibri" w:cs="Calibri"/>
+                <w:sz w:val="20"/>
+                <w:szCs w:val="20"/>
+              </w:rPr>
+            </w:pPr>
+            <w:r>
+              <w:rPr>
+                <w:rFonts w:ascii="Calibri" w:hAnsi="Calibri" w:cs="Calibri"/>
+                <w:sz w:val="20"/>
+                <w:szCs w:val="20"/>
+              </w:rPr>
+              <w:t>Worked</w:t>
+            </w:r>
+            <w:r>
+              <w:rPr>
+                <w:rFonts w:ascii="Calibri" w:hAnsi="Calibri" w:cs="Calibri"/>
+                <w:sz w:val="20"/>
+                <w:szCs w:val="20"/>
+              </w:rPr>
+              <w:t xml:space="preserve"> as a </w:t>
+            </w:r>
+            <w:r>
+              <w:rPr>
+                <w:rFonts w:ascii="Calibri" w:hAnsi="Calibri" w:cs="Calibri"/>
+                <w:b/>
+                <w:bCs/>
+                <w:sz w:val="20"/>
+                <w:szCs w:val="20"/>
+              </w:rPr>
+              <w:t>b</w:t>
+            </w:r>
+            <w:r>
+              <w:rPr>
+                <w:rFonts w:ascii="Calibri" w:hAnsi="Calibri" w:cs="Calibri"/>
+                <w:b/>
+                <w:bCs/>
+                <w:sz w:val="20"/>
+                <w:szCs w:val="20"/>
+              </w:rPr>
+              <w:t>ackend s</w:t>
+            </w:r>
+            <w:r>
+              <w:rPr>
+                <w:rFonts w:ascii="Calibri" w:hAnsi="Calibri" w:cs="Calibri"/>
+                <w:b/>
+                <w:bCs/>
+                <w:sz w:val="20"/>
+                <w:szCs w:val="20"/>
+              </w:rPr>
+              <w:t>oftware engineer</w:t>
             </w:r>
             <w:r>
               <w:rPr>
@@ -1062,149 +1156,14 @@
               </w:rPr>
               <w:t xml:space="preserve"> </w:t>
             </w:r>
-            <w:r>
-              <w:rPr>
-                <w:rFonts w:ascii="Calibri" w:hAnsi="Calibri" w:cs="Calibri"/>
-                <w:sz w:val="20"/>
-                <w:szCs w:val="20"/>
-              </w:rPr>
-              <w:t xml:space="preserve">to build </w:t>
-            </w:r>
-            <w:r>
-              <w:rPr>
-                <w:rFonts w:ascii="Calibri" w:hAnsi="Calibri" w:cs="Calibri"/>
-                <w:sz w:val="20"/>
-                <w:szCs w:val="20"/>
-              </w:rPr>
-              <w:t>P</w:t>
-            </w:r>
-            <w:r>
-              <w:rPr>
-                <w:rFonts w:ascii="Calibri" w:hAnsi="Calibri" w:cs="Calibri"/>
-                <w:sz w:val="20"/>
-                <w:szCs w:val="20"/>
-              </w:rPr>
-              <w:t xml:space="preserve">ython modules and standalone </w:t>
-            </w:r>
-            <w:r>
-              <w:rPr>
-                <w:rFonts w:ascii="Calibri" w:hAnsi="Calibri" w:cs="Calibri"/>
-                <w:sz w:val="20"/>
-                <w:szCs w:val="20"/>
-              </w:rPr>
-              <w:t xml:space="preserve">software </w:t>
-            </w:r>
-            <w:r>
-              <w:rPr>
-                <w:rFonts w:ascii="Calibri" w:hAnsi="Calibri" w:cs="Calibri"/>
-                <w:sz w:val="20"/>
-                <w:szCs w:val="20"/>
-              </w:rPr>
-              <w:t>capabilities</w:t>
-            </w:r>
-            <w:r>
-              <w:rPr>
-                <w:rFonts w:ascii="Calibri" w:hAnsi="Calibri" w:cs="Calibri"/>
-                <w:sz w:val="20"/>
-                <w:szCs w:val="20"/>
-              </w:rPr>
-              <w:t xml:space="preserve">, aiding the </w:t>
-            </w:r>
-            <w:r>
-              <w:rPr>
-                <w:rFonts w:ascii="Calibri" w:hAnsi="Calibri" w:cs="Calibri"/>
-                <w:sz w:val="20"/>
-                <w:szCs w:val="20"/>
-              </w:rPr>
-              <w:t>d</w:t>
-            </w:r>
-            <w:r>
-              <w:rPr>
-                <w:rFonts w:ascii="Calibri" w:hAnsi="Calibri" w:cs="Calibri"/>
-                <w:sz w:val="20"/>
-                <w:szCs w:val="20"/>
-              </w:rPr>
-              <w:t xml:space="preserve">ecision </w:t>
-            </w:r>
-            <w:r>
-              <w:rPr>
-                <w:rFonts w:ascii="Calibri" w:hAnsi="Calibri" w:cs="Calibri"/>
-                <w:sz w:val="20"/>
-                <w:szCs w:val="20"/>
-              </w:rPr>
-              <w:t>s</w:t>
-            </w:r>
-            <w:r>
-              <w:rPr>
-                <w:rFonts w:ascii="Calibri" w:hAnsi="Calibri" w:cs="Calibri"/>
-                <w:sz w:val="20"/>
-                <w:szCs w:val="20"/>
-              </w:rPr>
-              <w:t>cience teams in developing and upgrading the ML models more efficiently.</w:t>
-            </w:r>
-            <w:r>
-              <w:rPr>
-                <w:rFonts w:ascii="Calibri" w:hAnsi="Calibri" w:cs="Calibri"/>
-                <w:sz w:val="20"/>
-                <w:szCs w:val="20"/>
-              </w:rPr>
-              <w:t xml:space="preserve"> This brought down the </w:t>
-            </w:r>
-            <w:r>
-              <w:rPr>
-                <w:rFonts w:ascii="Calibri" w:hAnsi="Calibri" w:cs="Calibri"/>
-                <w:sz w:val="20"/>
-                <w:szCs w:val="20"/>
-              </w:rPr>
-              <w:t>t</w:t>
-            </w:r>
-            <w:r>
-              <w:rPr>
-                <w:rFonts w:ascii="Calibri" w:hAnsi="Calibri" w:cs="Calibri"/>
-                <w:sz w:val="20"/>
-                <w:szCs w:val="20"/>
-              </w:rPr>
-              <w:t>ime</w:t>
-            </w:r>
-            <w:r>
-              <w:rPr>
-                <w:rFonts w:ascii="Calibri" w:hAnsi="Calibri" w:cs="Calibri"/>
-                <w:sz w:val="20"/>
-                <w:szCs w:val="20"/>
-              </w:rPr>
-              <w:t>-</w:t>
-            </w:r>
-            <w:r>
-              <w:rPr>
-                <w:rFonts w:ascii="Calibri" w:hAnsi="Calibri" w:cs="Calibri"/>
-                <w:sz w:val="20"/>
-                <w:szCs w:val="20"/>
-              </w:rPr>
-              <w:t>to</w:t>
-            </w:r>
-            <w:r>
-              <w:rPr>
-                <w:rFonts w:ascii="Calibri" w:hAnsi="Calibri" w:cs="Calibri"/>
-                <w:sz w:val="20"/>
-                <w:szCs w:val="20"/>
-              </w:rPr>
-              <w:t>-</w:t>
-            </w:r>
-            <w:r>
-              <w:rPr>
-                <w:rFonts w:ascii="Calibri" w:hAnsi="Calibri" w:cs="Calibri"/>
-                <w:sz w:val="20"/>
-                <w:szCs w:val="20"/>
-              </w:rPr>
-              <w:t>m</w:t>
-            </w:r>
-            <w:r>
-              <w:rPr>
-                <w:rFonts w:ascii="Calibri" w:hAnsi="Calibri" w:cs="Calibri"/>
-                <w:sz w:val="20"/>
-                <w:szCs w:val="20"/>
-              </w:rPr>
-              <w:t>arket</w:t>
+            <w:bookmarkEnd w:id="3"/>
+            <w:r>
+              <w:rPr>
+                <w:rFonts w:ascii="Calibri" w:hAnsi="Calibri" w:cs="Calibri"/>
+                <w:sz w:val="20"/>
+                <w:szCs w:val="20"/>
+              </w:rPr>
+              <w:t>for</w:t>
             </w:r>
             <w:r>
               <w:rPr>
@@ -1220,9 +1179,542 @@
                 <w:sz w:val="20"/>
                 <w:szCs w:val="20"/>
               </w:rPr>
-              <w:t>by several weeks for each ML model, benefiting 20+ data science teams.</w:t>
+              <w:t>a critical</w:t>
+            </w:r>
+            <w:r>
+              <w:rPr>
+                <w:rFonts w:ascii="Calibri" w:hAnsi="Calibri" w:cs="Calibri"/>
+                <w:sz w:val="20"/>
+                <w:szCs w:val="20"/>
+              </w:rPr>
+              <w:t xml:space="preserve"> </w:t>
+            </w:r>
+            <w:r>
+              <w:rPr>
+                <w:rFonts w:ascii="Calibri" w:hAnsi="Calibri" w:cs="Calibri"/>
+                <w:sz w:val="20"/>
+                <w:szCs w:val="20"/>
+              </w:rPr>
+              <w:t>web</w:t>
+            </w:r>
+            <w:r>
+              <w:rPr>
+                <w:rFonts w:ascii="Calibri" w:hAnsi="Calibri" w:cs="Calibri"/>
+                <w:sz w:val="20"/>
+                <w:szCs w:val="20"/>
+              </w:rPr>
+              <w:t xml:space="preserve"> </w:t>
+            </w:r>
+            <w:r>
+              <w:rPr>
+                <w:rFonts w:ascii="Calibri" w:hAnsi="Calibri" w:cs="Calibri"/>
+                <w:sz w:val="20"/>
+                <w:szCs w:val="20"/>
+              </w:rPr>
+              <w:t>application</w:t>
+            </w:r>
+            <w:r>
+              <w:rPr>
+                <w:rFonts w:ascii="Calibri" w:hAnsi="Calibri" w:cs="Calibri"/>
+                <w:sz w:val="20"/>
+                <w:szCs w:val="20"/>
+              </w:rPr>
+              <w:t xml:space="preserve"> (AMC)</w:t>
+            </w:r>
+            <w:r>
+              <w:rPr>
+                <w:rFonts w:ascii="Calibri" w:hAnsi="Calibri" w:cs="Calibri"/>
+                <w:sz w:val="20"/>
+                <w:szCs w:val="20"/>
+              </w:rPr>
+              <w:t xml:space="preserve"> </w:t>
+            </w:r>
+            <w:r>
+              <w:rPr>
+                <w:rFonts w:ascii="Calibri" w:hAnsi="Calibri" w:cs="Calibri"/>
+                <w:sz w:val="20"/>
+                <w:szCs w:val="20"/>
+              </w:rPr>
+              <w:t>used by data scientists for</w:t>
+            </w:r>
+            <w:r>
+              <w:rPr>
+                <w:rFonts w:ascii="Calibri" w:hAnsi="Calibri" w:cs="Calibri"/>
+                <w:sz w:val="20"/>
+                <w:szCs w:val="20"/>
+              </w:rPr>
+              <w:t xml:space="preserve"> </w:t>
+            </w:r>
+            <w:r>
+              <w:rPr>
+                <w:rFonts w:ascii="Calibri" w:hAnsi="Calibri" w:cs="Calibri"/>
+                <w:sz w:val="20"/>
+                <w:szCs w:val="20"/>
+              </w:rPr>
+              <w:t>the development</w:t>
+            </w:r>
+            <w:r>
+              <w:rPr>
+                <w:rFonts w:ascii="Calibri" w:hAnsi="Calibri" w:cs="Calibri"/>
+                <w:sz w:val="20"/>
+                <w:szCs w:val="20"/>
+              </w:rPr>
+              <w:t xml:space="preserve">, </w:t>
+            </w:r>
+            <w:r>
+              <w:rPr>
+                <w:rFonts w:ascii="Calibri" w:hAnsi="Calibri" w:cs="Calibri"/>
+                <w:sz w:val="20"/>
+                <w:szCs w:val="20"/>
+              </w:rPr>
+              <w:t>testing,</w:t>
+            </w:r>
+            <w:r>
+              <w:rPr>
+                <w:rFonts w:ascii="Calibri" w:hAnsi="Calibri" w:cs="Calibri"/>
+                <w:sz w:val="20"/>
+                <w:szCs w:val="20"/>
+              </w:rPr>
+              <w:t xml:space="preserve"> governance,</w:t>
+            </w:r>
+            <w:r>
+              <w:rPr>
+                <w:rFonts w:ascii="Calibri" w:hAnsi="Calibri" w:cs="Calibri"/>
+                <w:sz w:val="20"/>
+                <w:szCs w:val="20"/>
+              </w:rPr>
+              <w:t xml:space="preserve"> and deployment of Machine Learning (ML) models at Amex</w:t>
             </w:r>
           </w:p>
+          <w:p>
+            <w:pPr>
+              <w:numPr>
+                <w:ilvl w:val="0"/>
+                <w:numId w:val="1"/>
+              </w:numPr>
+              <w:tabs>
+                <w:tab w:val="clear" w:pos="720"/>
+              </w:tabs>
+              <w:ind w:left="252" w:hanging="180"/>
+              <w:jc w:val="both"/>
+              <w:rPr>
+                <w:rFonts w:ascii="Calibri" w:hAnsi="Calibri" w:cs="Calibri"/>
+                <w:sz w:val="20"/>
+                <w:szCs w:val="20"/>
+              </w:rPr>
+            </w:pPr>
+            <w:bookmarkStart w:id="5" w:name="_Hlk152516239"/>
+            <w:bookmarkStart w:id="6" w:name="_Hlk152151040"/>
+            <w:bookmarkStart w:id="7" w:name="_Hlk152520106"/>
+            <w:bookmarkEnd w:id="4"/>
+            <w:r>
+              <w:rPr>
+                <w:rFonts w:ascii="Calibri" w:hAnsi="Calibri" w:cs="Calibri"/>
+                <w:sz w:val="20"/>
+                <w:szCs w:val="20"/>
+              </w:rPr>
+              <w:t>Led</w:t>
+            </w:r>
+            <w:r>
+              <w:rPr>
+                <w:rFonts w:ascii="Calibri" w:hAnsi="Calibri" w:cs="Calibri"/>
+                <w:sz w:val="20"/>
+                <w:szCs w:val="20"/>
+              </w:rPr>
+              <w:t xml:space="preserve"> a team</w:t>
+            </w:r>
+            <w:r>
+              <w:rPr>
+                <w:rFonts w:ascii="Calibri" w:hAnsi="Calibri" w:cs="Calibri"/>
+                <w:sz w:val="20"/>
+                <w:szCs w:val="20"/>
+              </w:rPr>
+              <w:t xml:space="preserve"> of four</w:t>
+            </w:r>
+            <w:r>
+              <w:rPr>
+                <w:rFonts w:ascii="Calibri" w:hAnsi="Calibri" w:cs="Calibri"/>
+                <w:sz w:val="20"/>
+                <w:szCs w:val="20"/>
+              </w:rPr>
+              <w:t xml:space="preserve"> to build</w:t>
+            </w:r>
+            <w:r>
+              <w:rPr>
+                <w:rFonts w:ascii="Calibri" w:hAnsi="Calibri" w:cs="Calibri"/>
+                <w:sz w:val="20"/>
+                <w:szCs w:val="20"/>
+              </w:rPr>
+              <w:t xml:space="preserve"> and own</w:t>
+            </w:r>
+            <w:r>
+              <w:rPr>
+                <w:rFonts w:ascii="Calibri" w:hAnsi="Calibri" w:cs="Calibri"/>
+                <w:sz w:val="20"/>
+                <w:szCs w:val="20"/>
+              </w:rPr>
+              <w:t xml:space="preserve"> </w:t>
+            </w:r>
+            <w:r>
+              <w:rPr>
+                <w:rFonts w:ascii="Calibri" w:hAnsi="Calibri" w:cs="Calibri"/>
+                <w:sz w:val="20"/>
+                <w:szCs w:val="20"/>
+              </w:rPr>
+              <w:t xml:space="preserve">a </w:t>
+            </w:r>
+            <w:r>
+              <w:rPr>
+                <w:rFonts w:ascii="Calibri" w:hAnsi="Calibri" w:cs="Calibri"/>
+                <w:sz w:val="20"/>
+                <w:szCs w:val="20"/>
+              </w:rPr>
+              <w:t>pivotal pipeline</w:t>
+            </w:r>
+            <w:r>
+              <w:rPr>
+                <w:rFonts w:ascii="Calibri" w:hAnsi="Calibri" w:cs="Calibri"/>
+                <w:sz w:val="20"/>
+                <w:szCs w:val="20"/>
+              </w:rPr>
+              <w:t xml:space="preserve"> </w:t>
+            </w:r>
+            <w:r>
+              <w:rPr>
+                <w:rFonts w:ascii="Calibri" w:hAnsi="Calibri" w:cs="Calibri"/>
+                <w:sz w:val="20"/>
+                <w:szCs w:val="20"/>
+              </w:rPr>
+              <w:t>that bridges</w:t>
+            </w:r>
+            <w:r>
+              <w:rPr>
+                <w:rFonts w:ascii="Calibri" w:hAnsi="Calibri" w:cs="Calibri"/>
+                <w:sz w:val="20"/>
+                <w:szCs w:val="20"/>
+              </w:rPr>
+              <w:t xml:space="preserve"> </w:t>
+            </w:r>
+            <w:r>
+              <w:rPr>
+                <w:rFonts w:ascii="Calibri" w:hAnsi="Calibri" w:cs="Calibri"/>
+                <w:sz w:val="20"/>
+                <w:szCs w:val="20"/>
+              </w:rPr>
+              <w:t xml:space="preserve">the gap between the </w:t>
+            </w:r>
+            <w:r>
+              <w:rPr>
+                <w:rFonts w:ascii="Calibri" w:hAnsi="Calibri" w:cs="Calibri"/>
+                <w:sz w:val="20"/>
+                <w:szCs w:val="20"/>
+              </w:rPr>
+              <w:t>data scientists</w:t>
+            </w:r>
+            <w:r>
+              <w:rPr>
+                <w:rFonts w:ascii="Calibri" w:hAnsi="Calibri" w:cs="Calibri"/>
+                <w:sz w:val="20"/>
+                <w:szCs w:val="20"/>
+              </w:rPr>
+              <w:t xml:space="preserve"> and the </w:t>
+            </w:r>
+            <w:r>
+              <w:rPr>
+                <w:rFonts w:ascii="Calibri" w:hAnsi="Calibri" w:cs="Calibri"/>
+                <w:sz w:val="20"/>
+                <w:szCs w:val="20"/>
+              </w:rPr>
+              <w:t xml:space="preserve">real-time </w:t>
+            </w:r>
+            <w:r>
+              <w:rPr>
+                <w:rFonts w:ascii="Calibri" w:hAnsi="Calibri" w:cs="Calibri"/>
+                <w:sz w:val="20"/>
+                <w:szCs w:val="20"/>
+              </w:rPr>
+              <w:t>execut</w:t>
+            </w:r>
+            <w:r>
+              <w:rPr>
+                <w:rFonts w:ascii="Calibri" w:hAnsi="Calibri" w:cs="Calibri"/>
+                <w:sz w:val="20"/>
+                <w:szCs w:val="20"/>
+              </w:rPr>
+              <w:t>ion platform</w:t>
+            </w:r>
+            <w:r>
+              <w:rPr>
+                <w:rFonts w:ascii="Calibri" w:hAnsi="Calibri" w:cs="Calibri"/>
+                <w:sz w:val="20"/>
+                <w:szCs w:val="20"/>
+              </w:rPr>
+              <w:t>,</w:t>
+            </w:r>
+            <w:r>
+              <w:rPr>
+                <w:rFonts w:ascii="Calibri" w:hAnsi="Calibri" w:cs="Calibri"/>
+                <w:sz w:val="20"/>
+                <w:szCs w:val="20"/>
+              </w:rPr>
+              <w:t xml:space="preserve"> </w:t>
+            </w:r>
+            <w:r>
+              <w:rPr>
+                <w:rFonts w:ascii="Calibri" w:hAnsi="Calibri" w:cs="Calibri"/>
+                <w:sz w:val="20"/>
+                <w:szCs w:val="20"/>
+              </w:rPr>
+              <w:t xml:space="preserve">directly </w:t>
+            </w:r>
+            <w:r>
+              <w:rPr>
+                <w:rFonts w:ascii="Calibri" w:hAnsi="Calibri" w:cs="Calibri"/>
+                <w:sz w:val="20"/>
+                <w:szCs w:val="20"/>
+              </w:rPr>
+              <w:t xml:space="preserve">supporting ML models with </w:t>
+            </w:r>
+            <w:r>
+              <w:rPr>
+                <w:rFonts w:ascii="Calibri" w:hAnsi="Calibri" w:cs="Calibri"/>
+                <w:sz w:val="20"/>
+                <w:szCs w:val="20"/>
+              </w:rPr>
+              <w:t xml:space="preserve">a </w:t>
+            </w:r>
+            <w:r>
+              <w:rPr>
+                <w:rFonts w:ascii="Calibri" w:hAnsi="Calibri" w:cs="Calibri"/>
+                <w:sz w:val="20"/>
+                <w:szCs w:val="20"/>
+              </w:rPr>
+              <w:t xml:space="preserve">combined </w:t>
+            </w:r>
+            <w:r>
+              <w:rPr>
+                <w:rFonts w:ascii="Calibri" w:hAnsi="Calibri" w:cs="Calibri"/>
+                <w:b/>
+                <w:bCs/>
+                <w:sz w:val="20"/>
+                <w:szCs w:val="20"/>
+              </w:rPr>
+              <w:t>pre-tax income benefit of over $50 million</w:t>
+            </w:r>
+            <w:r>
+              <w:rPr>
+                <w:rFonts w:ascii="Calibri" w:hAnsi="Calibri" w:cs="Calibri"/>
+                <w:sz w:val="20"/>
+                <w:szCs w:val="20"/>
+              </w:rPr>
+              <w:t xml:space="preserve"> in 2023.</w:t>
+            </w:r>
+          </w:p>
+          <w:p>
+            <w:pPr>
+              <w:numPr>
+                <w:ilvl w:val="0"/>
+                <w:numId w:val="1"/>
+              </w:numPr>
+              <w:tabs>
+                <w:tab w:val="clear" w:pos="720"/>
+              </w:tabs>
+              <w:ind w:left="252" w:hanging="180"/>
+              <w:jc w:val="both"/>
+              <w:rPr>
+                <w:rFonts w:ascii="Calibri" w:hAnsi="Calibri" w:cs="Calibri"/>
+                <w:sz w:val="20"/>
+                <w:szCs w:val="20"/>
+              </w:rPr>
+            </w:pPr>
+            <w:bookmarkStart w:id="8" w:name="_Hlk152518940"/>
+            <w:bookmarkEnd w:id="5"/>
+            <w:r>
+              <w:rPr>
+                <w:rFonts w:ascii="Calibri" w:hAnsi="Calibri" w:cs="Calibri"/>
+                <w:sz w:val="20"/>
+                <w:szCs w:val="20"/>
+              </w:rPr>
+              <w:t>R</w:t>
+            </w:r>
+            <w:r>
+              <w:rPr>
+                <w:rFonts w:ascii="Calibri" w:hAnsi="Calibri" w:cs="Calibri"/>
+                <w:sz w:val="20"/>
+                <w:szCs w:val="20"/>
+              </w:rPr>
+              <w:t>efactor</w:t>
+            </w:r>
+            <w:r>
+              <w:rPr>
+                <w:rFonts w:ascii="Calibri" w:hAnsi="Calibri" w:cs="Calibri"/>
+                <w:sz w:val="20"/>
+                <w:szCs w:val="20"/>
+              </w:rPr>
+              <w:t>ed</w:t>
+            </w:r>
+            <w:r>
+              <w:rPr>
+                <w:rFonts w:ascii="Calibri" w:hAnsi="Calibri" w:cs="Calibri"/>
+                <w:sz w:val="20"/>
+                <w:szCs w:val="20"/>
+              </w:rPr>
+              <w:t xml:space="preserve"> </w:t>
+            </w:r>
+            <w:r>
+              <w:rPr>
+                <w:rFonts w:ascii="Calibri" w:hAnsi="Calibri" w:cs="Calibri"/>
+                <w:sz w:val="20"/>
+                <w:szCs w:val="20"/>
+              </w:rPr>
+              <w:t>the</w:t>
+            </w:r>
+            <w:r>
+              <w:rPr>
+                <w:rFonts w:ascii="Calibri" w:hAnsi="Calibri" w:cs="Calibri"/>
+                <w:sz w:val="20"/>
+                <w:szCs w:val="20"/>
+              </w:rPr>
+              <w:t xml:space="preserve"> </w:t>
+            </w:r>
+            <w:r>
+              <w:rPr>
+                <w:rFonts w:ascii="Calibri" w:hAnsi="Calibri" w:cs="Calibri"/>
+                <w:sz w:val="20"/>
+                <w:szCs w:val="20"/>
+              </w:rPr>
+              <w:t xml:space="preserve">AMC </w:t>
+            </w:r>
+            <w:r>
+              <w:rPr>
+                <w:rFonts w:ascii="Calibri" w:hAnsi="Calibri" w:cs="Calibri"/>
+                <w:sz w:val="20"/>
+                <w:szCs w:val="20"/>
+              </w:rPr>
+              <w:t>monolith</w:t>
+            </w:r>
+            <w:r>
+              <w:rPr>
+                <w:rFonts w:ascii="Calibri" w:hAnsi="Calibri" w:cs="Calibri"/>
+                <w:sz w:val="20"/>
+                <w:szCs w:val="20"/>
+              </w:rPr>
+              <w:t>ic</w:t>
+            </w:r>
+            <w:r>
+              <w:rPr>
+                <w:rFonts w:ascii="Calibri" w:hAnsi="Calibri" w:cs="Calibri"/>
+                <w:sz w:val="20"/>
+                <w:szCs w:val="20"/>
+              </w:rPr>
+              <w:t xml:space="preserve"> </w:t>
+            </w:r>
+            <w:r>
+              <w:rPr>
+                <w:rFonts w:ascii="Calibri" w:hAnsi="Calibri" w:cs="Calibri"/>
+                <w:sz w:val="20"/>
+                <w:szCs w:val="20"/>
+              </w:rPr>
+              <w:t xml:space="preserve">codebase </w:t>
+            </w:r>
+            <w:r>
+              <w:rPr>
+                <w:rFonts w:ascii="Calibri" w:hAnsi="Calibri" w:cs="Calibri"/>
+                <w:sz w:val="20"/>
+                <w:szCs w:val="20"/>
+              </w:rPr>
+              <w:t>into</w:t>
+            </w:r>
+            <w:r>
+              <w:rPr>
+                <w:rFonts w:ascii="Calibri" w:hAnsi="Calibri" w:cs="Calibri"/>
+                <w:sz w:val="20"/>
+                <w:szCs w:val="20"/>
+              </w:rPr>
+              <w:t xml:space="preserve"> </w:t>
+            </w:r>
+            <w:r>
+              <w:rPr>
+                <w:rFonts w:ascii="Calibri" w:hAnsi="Calibri" w:cs="Calibri"/>
+                <w:sz w:val="20"/>
+                <w:szCs w:val="20"/>
+              </w:rPr>
+              <w:t>microservices</w:t>
+            </w:r>
+            <w:r>
+              <w:rPr>
+                <w:rFonts w:ascii="Calibri" w:hAnsi="Calibri" w:cs="Calibri"/>
+                <w:sz w:val="20"/>
+                <w:szCs w:val="20"/>
+              </w:rPr>
+              <w:t xml:space="preserve">, </w:t>
+            </w:r>
+            <w:r>
+              <w:rPr>
+                <w:rFonts w:ascii="Calibri" w:hAnsi="Calibri" w:cs="Calibri"/>
+                <w:sz w:val="20"/>
+                <w:szCs w:val="20"/>
+              </w:rPr>
+              <w:t>reduc</w:t>
+            </w:r>
+            <w:r>
+              <w:rPr>
+                <w:rFonts w:ascii="Calibri" w:hAnsi="Calibri" w:cs="Calibri"/>
+                <w:sz w:val="20"/>
+                <w:szCs w:val="20"/>
+              </w:rPr>
+              <w:t>ing</w:t>
+            </w:r>
+            <w:r>
+              <w:rPr>
+                <w:rFonts w:ascii="Calibri" w:hAnsi="Calibri" w:cs="Calibri"/>
+                <w:sz w:val="20"/>
+                <w:szCs w:val="20"/>
+              </w:rPr>
+              <w:t xml:space="preserve"> code complexity</w:t>
+            </w:r>
+            <w:r>
+              <w:rPr>
+                <w:rFonts w:ascii="Calibri" w:hAnsi="Calibri" w:cs="Calibri"/>
+                <w:sz w:val="20"/>
+                <w:szCs w:val="20"/>
+              </w:rPr>
+              <w:t xml:space="preserve"> and </w:t>
+            </w:r>
+            <w:r>
+              <w:rPr>
+                <w:rFonts w:ascii="Calibri" w:hAnsi="Calibri" w:cs="Calibri"/>
+                <w:sz w:val="20"/>
+                <w:szCs w:val="20"/>
+              </w:rPr>
+              <w:t>improv</w:t>
+            </w:r>
+            <w:r>
+              <w:rPr>
+                <w:rFonts w:ascii="Calibri" w:hAnsi="Calibri" w:cs="Calibri"/>
+                <w:sz w:val="20"/>
+                <w:szCs w:val="20"/>
+              </w:rPr>
+              <w:t xml:space="preserve">ing </w:t>
+            </w:r>
+            <w:r>
+              <w:rPr>
+                <w:rFonts w:ascii="Calibri" w:hAnsi="Calibri" w:cs="Calibri"/>
+                <w:sz w:val="20"/>
+                <w:szCs w:val="20"/>
+              </w:rPr>
+              <w:t>maintainability</w:t>
+            </w:r>
+            <w:r>
+              <w:rPr>
+                <w:rFonts w:ascii="Calibri" w:hAnsi="Calibri" w:cs="Calibri"/>
+                <w:sz w:val="20"/>
+                <w:szCs w:val="20"/>
+              </w:rPr>
+              <w:t>.</w:t>
+            </w:r>
+          </w:p>
+          <w:bookmarkEnd w:id="6"/>
           <w:bookmarkEnd w:id="8"/>
           <w:p>
             <w:pPr>
@@ -1247,10 +1739,303 @@
                 <w:sz w:val="20"/>
                 <w:szCs w:val="20"/>
               </w:rPr>
+              <w:t xml:space="preserve">Designed and developed the CI/CD pipeline for the application, </w:t>
+            </w:r>
+            <w:r>
+              <w:rPr>
+                <w:rFonts w:ascii="Calibri" w:hAnsi="Calibri" w:cs="Calibri"/>
+                <w:sz w:val="20"/>
+                <w:szCs w:val="20"/>
+              </w:rPr>
+              <w:t>eliminat</w:t>
+            </w:r>
+            <w:r>
+              <w:rPr>
+                <w:rFonts w:ascii="Calibri" w:hAnsi="Calibri" w:cs="Calibri"/>
+                <w:sz w:val="20"/>
+                <w:szCs w:val="20"/>
+              </w:rPr>
+              <w:t>ing</w:t>
+            </w:r>
+            <w:r>
+              <w:rPr>
+                <w:rFonts w:ascii="Calibri" w:hAnsi="Calibri" w:cs="Calibri"/>
+                <w:sz w:val="20"/>
+                <w:szCs w:val="20"/>
+              </w:rPr>
+              <w:t xml:space="preserve"> manual errors and </w:t>
+            </w:r>
+            <w:r>
+              <w:rPr>
+                <w:rFonts w:ascii="Calibri" w:hAnsi="Calibri" w:cs="Calibri"/>
+                <w:sz w:val="20"/>
+                <w:szCs w:val="20"/>
+              </w:rPr>
+              <w:t>reducing</w:t>
+            </w:r>
+            <w:r>
+              <w:rPr>
+                <w:rFonts w:ascii="Calibri" w:hAnsi="Calibri" w:cs="Calibri"/>
+                <w:sz w:val="20"/>
+                <w:szCs w:val="20"/>
+              </w:rPr>
+              <w:t xml:space="preserve"> the time-to-market for new features and bug fixes</w:t>
+            </w:r>
+            <w:r>
+              <w:rPr>
+                <w:rFonts w:ascii="Calibri" w:hAnsi="Calibri" w:cs="Calibri"/>
+                <w:sz w:val="20"/>
+                <w:szCs w:val="20"/>
+              </w:rPr>
+              <w:t>.</w:t>
+            </w:r>
+            <w:r>
+              <w:rPr>
+                <w:rFonts w:ascii="Calibri" w:hAnsi="Calibri" w:cs="Calibri"/>
+                <w:sz w:val="20"/>
+                <w:szCs w:val="20"/>
+              </w:rPr>
+              <w:t xml:space="preserve"> Additionally, coordinated with platform teams for infrastructure maintenance</w:t>
+            </w:r>
+            <w:r>
+              <w:rPr>
+                <w:rFonts w:ascii="Calibri" w:hAnsi="Calibri" w:cs="Calibri"/>
+                <w:sz w:val="20"/>
+                <w:szCs w:val="20"/>
+              </w:rPr>
+              <w:t xml:space="preserve"> and stability.</w:t>
+            </w:r>
+          </w:p>
+          <w:p>
+            <w:pPr>
+              <w:numPr>
+                <w:ilvl w:val="0"/>
+                <w:numId w:val="1"/>
+              </w:numPr>
+              <w:tabs>
+                <w:tab w:val="clear" w:pos="720"/>
+              </w:tabs>
+              <w:ind w:left="252" w:hanging="180"/>
+              <w:jc w:val="both"/>
+              <w:rPr>
+                <w:rFonts w:ascii="Calibri" w:hAnsi="Calibri" w:cs="Calibri"/>
+                <w:sz w:val="20"/>
+                <w:szCs w:val="20"/>
+              </w:rPr>
+            </w:pPr>
+            <w:r>
+              <w:rPr>
+                <w:rFonts w:ascii="Calibri" w:hAnsi="Calibri" w:cs="Calibri"/>
+                <w:sz w:val="20"/>
+                <w:szCs w:val="20"/>
+              </w:rPr>
+              <w:t>Mentored</w:t>
+            </w:r>
+            <w:r>
+              <w:rPr>
+                <w:rFonts w:ascii="Calibri" w:hAnsi="Calibri" w:cs="Calibri"/>
+                <w:sz w:val="20"/>
+                <w:szCs w:val="20"/>
+              </w:rPr>
+              <w:t xml:space="preserve"> seven colleagues</w:t>
+            </w:r>
+            <w:r>
+              <w:rPr>
+                <w:rFonts w:ascii="Calibri" w:hAnsi="Calibri" w:cs="Calibri"/>
+                <w:sz w:val="20"/>
+                <w:szCs w:val="20"/>
+              </w:rPr>
+              <w:t xml:space="preserve"> </w:t>
+            </w:r>
+            <w:r>
+              <w:rPr>
+                <w:rFonts w:ascii="Calibri" w:hAnsi="Calibri" w:cs="Calibri"/>
+                <w:sz w:val="20"/>
+                <w:szCs w:val="20"/>
+              </w:rPr>
+              <w:t xml:space="preserve">to build </w:t>
+            </w:r>
+            <w:r>
+              <w:rPr>
+                <w:rFonts w:ascii="Calibri" w:hAnsi="Calibri" w:cs="Calibri"/>
+                <w:sz w:val="20"/>
+                <w:szCs w:val="20"/>
+              </w:rPr>
+              <w:t>P</w:t>
+            </w:r>
+            <w:r>
+              <w:rPr>
+                <w:rFonts w:ascii="Calibri" w:hAnsi="Calibri" w:cs="Calibri"/>
+                <w:sz w:val="20"/>
+                <w:szCs w:val="20"/>
+              </w:rPr>
+              <w:t xml:space="preserve">ython modules and standalone </w:t>
+            </w:r>
+            <w:r>
+              <w:rPr>
+                <w:rFonts w:ascii="Calibri" w:hAnsi="Calibri" w:cs="Calibri"/>
+                <w:sz w:val="20"/>
+                <w:szCs w:val="20"/>
+              </w:rPr>
+              <w:t xml:space="preserve">software </w:t>
+            </w:r>
+            <w:r>
+              <w:rPr>
+                <w:rFonts w:ascii="Calibri" w:hAnsi="Calibri" w:cs="Calibri"/>
+                <w:sz w:val="20"/>
+                <w:szCs w:val="20"/>
+              </w:rPr>
+              <w:t>capabilities</w:t>
+            </w:r>
+            <w:r>
+              <w:rPr>
+                <w:rFonts w:ascii="Calibri" w:hAnsi="Calibri" w:cs="Calibri"/>
+                <w:sz w:val="20"/>
+                <w:szCs w:val="20"/>
+              </w:rPr>
+              <w:t xml:space="preserve">, aiding the </w:t>
+            </w:r>
+            <w:r>
+              <w:rPr>
+                <w:rFonts w:ascii="Calibri" w:hAnsi="Calibri" w:cs="Calibri"/>
+                <w:sz w:val="20"/>
+                <w:szCs w:val="20"/>
+              </w:rPr>
+              <w:t>d</w:t>
+            </w:r>
+            <w:r>
+              <w:rPr>
+                <w:rFonts w:ascii="Calibri" w:hAnsi="Calibri" w:cs="Calibri"/>
+                <w:sz w:val="20"/>
+                <w:szCs w:val="20"/>
+              </w:rPr>
+              <w:t xml:space="preserve">ecision </w:t>
+            </w:r>
+            <w:r>
+              <w:rPr>
+                <w:rFonts w:ascii="Calibri" w:hAnsi="Calibri" w:cs="Calibri"/>
+                <w:sz w:val="20"/>
+                <w:szCs w:val="20"/>
+              </w:rPr>
+              <w:t>s</w:t>
+            </w:r>
+            <w:r>
+              <w:rPr>
+                <w:rFonts w:ascii="Calibri" w:hAnsi="Calibri" w:cs="Calibri"/>
+                <w:sz w:val="20"/>
+                <w:szCs w:val="20"/>
+              </w:rPr>
+              <w:t>cience teams in developing and upgrading the ML models more efficiently.</w:t>
+            </w:r>
+            <w:r>
+              <w:rPr>
+                <w:rFonts w:ascii="Calibri" w:hAnsi="Calibri" w:cs="Calibri"/>
+                <w:sz w:val="20"/>
+                <w:szCs w:val="20"/>
+              </w:rPr>
+              <w:t xml:space="preserve"> This brought down the </w:t>
+            </w:r>
+            <w:r>
+              <w:rPr>
+                <w:rFonts w:ascii="Calibri" w:hAnsi="Calibri" w:cs="Calibri"/>
+                <w:sz w:val="20"/>
+                <w:szCs w:val="20"/>
+              </w:rPr>
+              <w:t>t</w:t>
+            </w:r>
+            <w:r>
+              <w:rPr>
+                <w:rFonts w:ascii="Calibri" w:hAnsi="Calibri" w:cs="Calibri"/>
+                <w:sz w:val="20"/>
+                <w:szCs w:val="20"/>
+              </w:rPr>
+              <w:t>ime</w:t>
+            </w:r>
+            <w:r>
+              <w:rPr>
+                <w:rFonts w:ascii="Calibri" w:hAnsi="Calibri" w:cs="Calibri"/>
+                <w:sz w:val="20"/>
+                <w:szCs w:val="20"/>
+              </w:rPr>
+              <w:t>-</w:t>
+            </w:r>
+            <w:r>
+              <w:rPr>
+                <w:rFonts w:ascii="Calibri" w:hAnsi="Calibri" w:cs="Calibri"/>
+                <w:sz w:val="20"/>
+                <w:szCs w:val="20"/>
+              </w:rPr>
+              <w:t>to</w:t>
+            </w:r>
+            <w:r>
+              <w:rPr>
+                <w:rFonts w:ascii="Calibri" w:hAnsi="Calibri" w:cs="Calibri"/>
+                <w:sz w:val="20"/>
+                <w:szCs w:val="20"/>
+              </w:rPr>
+              <w:t>-</w:t>
+            </w:r>
+            <w:r>
+              <w:rPr>
+                <w:rFonts w:ascii="Calibri" w:hAnsi="Calibri" w:cs="Calibri"/>
+                <w:sz w:val="20"/>
+                <w:szCs w:val="20"/>
+              </w:rPr>
+              <w:t>m</w:t>
+            </w:r>
+            <w:r>
+              <w:rPr>
+                <w:rFonts w:ascii="Calibri" w:hAnsi="Calibri" w:cs="Calibri"/>
+                <w:sz w:val="20"/>
+                <w:szCs w:val="20"/>
+              </w:rPr>
+              <w:t>arket</w:t>
+            </w:r>
+            <w:r>
+              <w:rPr>
+                <w:rFonts w:ascii="Calibri" w:hAnsi="Calibri" w:cs="Calibri"/>
+                <w:sz w:val="20"/>
+                <w:szCs w:val="20"/>
+              </w:rPr>
+              <w:t xml:space="preserve"> </w:t>
+            </w:r>
+            <w:r>
+              <w:rPr>
+                <w:rFonts w:ascii="Calibri" w:hAnsi="Calibri" w:cs="Calibri"/>
+                <w:sz w:val="20"/>
+                <w:szCs w:val="20"/>
+              </w:rPr>
+              <w:t>by several weeks for each ML model, benefiting 20+ data science teams.</w:t>
+            </w:r>
+          </w:p>
+          <w:bookmarkEnd w:id="7"/>
+          <w:p>
+            <w:pPr>
+              <w:numPr>
+                <w:ilvl w:val="0"/>
+                <w:numId w:val="1"/>
+              </w:numPr>
+              <w:tabs>
+                <w:tab w:val="clear" w:pos="720"/>
+              </w:tabs>
+              <w:ind w:left="252" w:hanging="180"/>
+              <w:jc w:val="both"/>
+              <w:rPr>
+                <w:rFonts w:ascii="Calibri" w:hAnsi="Calibri" w:cs="Calibri"/>
+                <w:sz w:val="20"/>
+                <w:szCs w:val="20"/>
+              </w:rPr>
+            </w:pPr>
+            <w:r>
+              <w:rPr>
+                <w:rFonts w:ascii="Calibri" w:hAnsi="Calibri" w:cs="Calibri"/>
+                <w:sz w:val="20"/>
+                <w:szCs w:val="20"/>
+              </w:rPr>
               <w:t>Promoted from Associate to Sr. Associate in February 2023.</w:t>
             </w:r>
           </w:p>
-          <w:bookmarkEnd w:id="5"/>
+          <w:bookmarkEnd w:id="2"/>
           <w:p>
             <w:pPr>
               <w:ind w:left="252"/>
@@ -1263,7 +2048,6 @@
           </w:p>
         </w:tc>
       </w:tr>
-      <w:bookmarkEnd w:id="2"/>
       <w:tr>
         <w:trPr>
           <w:trHeight w:val="69"/>
@@ -1404,7 +2188,7 @@
                 <w:szCs w:val="20"/>
               </w:rPr>
             </w:pPr>
-            <w:bookmarkStart w:id="10" w:name="_Hlk144189098"/>
+            <w:bookmarkStart w:id="9" w:name="_Hlk144189098"/>
             <w:r>
               <w:rPr>
                 <w:rFonts w:ascii="Calibri" w:hAnsi="Calibri" w:cs="Calibri"/>
@@ -1430,7 +2214,7 @@
               <w:t>.</w:t>
             </w:r>
           </w:p>
-          <w:bookmarkEnd w:id="10"/>
+          <w:bookmarkEnd w:id="9"/>
           <w:p>
             <w:pPr>
               <w:numPr>
@@ -1676,7 +2460,23 @@
                 <w:sz w:val="20"/>
                 <w:szCs w:val="20"/>
               </w:rPr>
-              <w:t xml:space="preserve"> an </w:t>
+              <w:t xml:space="preserve"> </w:t>
+            </w:r>
+            <w:r>
+              <w:rPr>
+                <w:rFonts w:ascii="Calibri" w:hAnsi="Calibri" w:cs="Calibri"/>
+                <w:sz w:val="20"/>
+                <w:szCs w:val="20"/>
+              </w:rPr>
+              <w:t xml:space="preserve">of </w:t>
+            </w:r>
+            <w:r>
+              <w:rPr>
+                <w:rFonts w:ascii="Calibri" w:hAnsi="Calibri" w:cs="Calibri"/>
+                <w:sz w:val="20"/>
+                <w:szCs w:val="20"/>
+              </w:rPr>
+              <w:t xml:space="preserve">an </w:t>
             </w:r>
             <w:r>
               <w:rPr>
@@ -2006,7 +2806,7 @@
               </w:rPr>
               <w:t>/10</w:t>
             </w:r>
-            <w:bookmarkStart w:id="11" w:name="_Hlk158931231"/>
+            <w:bookmarkStart w:id="10" w:name="_Hlk158931231"/>
             <w:r>
               <w:rPr>
                 <w:rFonts w:ascii="Calibri" w:hAnsi="Calibri" w:cs="Calibri"/>
@@ -2113,7 +2913,7 @@
               <w:t>.</w:t>
             </w:r>
           </w:p>
-          <w:bookmarkEnd w:id="11"/>
+          <w:bookmarkEnd w:id="10"/>
           <w:p>
             <w:pPr>
               <w:ind w:left="252"/>
@@ -2248,7 +3048,7 @@
                 <w:szCs w:val="20"/>
               </w:rPr>
             </w:pPr>
-            <w:bookmarkStart w:id="12" w:name="_Hlk144192934"/>
+            <w:bookmarkStart w:id="11" w:name="_Hlk144192934"/>
             <w:r>
               <w:rPr>
                 <w:rFonts w:ascii="Calibri" w:hAnsi="Calibri" w:cs="Calibri"/>
@@ -2314,7 +3114,7 @@
               <w:t>.</w:t>
             </w:r>
           </w:p>
-          <w:bookmarkEnd w:id="12"/>
+          <w:bookmarkEnd w:id="11"/>
           <w:p>
             <w:pPr>
               <w:ind w:left="252"/>
@@ -2388,46 +3188,81 @@
               <w:pStyle w:val="Achievement"/>
               <w:rPr>
                 <w:rFonts w:ascii="Calibri" w:hAnsi="Calibri" w:cs="Calibri"/>
+              </w:rPr>
+            </w:pPr>
+            <w:bookmarkStart w:id="12" w:name="_Hlk164984580"/>
+            <w:r>
+              <w:rPr>
+                <w:rFonts w:ascii="Calibri" w:hAnsi="Calibri" w:cs="Calibri"/>
+                <w:b/>
+                <w:bCs w:val="0"/>
                 <w:lang w:val="en-IN"/>
               </w:rPr>
-            </w:pPr>
-            <w:bookmarkStart w:id="13" w:name="_Hlk164984580"/>
-            <w:r>
-              <w:rPr>
-                <w:rFonts w:ascii="Calibri" w:hAnsi="Calibri" w:cs="Calibri"/>
+              <w:t>Product</w:t>
+            </w:r>
+            <w:r>
+              <w:rPr>
+                <w:rFonts w:ascii="Calibri" w:hAnsi="Calibri" w:cs="Calibri"/>
+                <w:b/>
+                <w:bCs w:val="0"/>
                 <w:lang w:val="en-IN"/>
               </w:rPr>
-              <w:t xml:space="preserve">Python (work experience), C++ (data structures &amp; algorithms), </w:t>
+              <w:t xml:space="preserve"> &amp; Agile</w:t>
             </w:r>
             <w:r>
               <w:rPr>
                 <w:rFonts w:ascii="Calibri" w:hAnsi="Calibri" w:cs="Calibri"/>
                 <w:lang w:val="en-IN"/>
               </w:rPr>
-              <w:t>Swift (internship)</w:t>
-            </w:r>
-            <w:r>
-              <w:rPr>
-                <w:rFonts w:ascii="Calibri" w:hAnsi="Calibri" w:cs="Calibri"/>
-                <w:lang w:val="en-IN"/>
+              <w:t xml:space="preserve">: </w:t>
+            </w:r>
+            <w:r>
+              <w:rPr>
+                <w:rFonts w:ascii="Calibri" w:hAnsi="Calibri" w:cs="Calibri"/>
+              </w:rPr>
+              <w:t>Product Ownership, Backlog Management, Sprint Planning, Stakeholder Management, Requirement Gathering</w:t>
+            </w:r>
+            <w:r>
+              <w:rPr>
+                <w:rFonts w:ascii="Calibri" w:hAnsi="Calibri" w:cs="Calibri"/>
+              </w:rPr>
+              <w:t xml:space="preserve"> (Jira)</w:t>
+            </w:r>
+            <w:r>
+              <w:rPr>
+                <w:rFonts w:ascii="Calibri" w:hAnsi="Calibri" w:cs="Calibri"/>
               </w:rPr>
               <w:t xml:space="preserve">, </w:t>
             </w:r>
-            <w:bookmarkStart w:id="14" w:name="_Hlk164984571"/>
-            <w:r>
-              <w:rPr>
-                <w:rFonts w:ascii="Calibri" w:hAnsi="Calibri" w:cs="Calibri"/>
-                <w:lang w:val="en-IN"/>
-              </w:rPr>
-              <w:t>and Core Java</w:t>
-            </w:r>
-            <w:bookmarkEnd w:id="14"/>
-            <w:r>
-              <w:rPr>
-                <w:rFonts w:ascii="Calibri" w:hAnsi="Calibri" w:cs="Calibri"/>
-                <w:lang w:val="en-IN"/>
-              </w:rPr>
-              <w:t>.</w:t>
+            <w:r>
+              <w:rPr>
+                <w:rFonts w:ascii="Calibri" w:hAnsi="Calibri" w:cs="Calibri"/>
+              </w:rPr>
+              <w:t xml:space="preserve">Defining </w:t>
+            </w:r>
+            <w:r>
+              <w:rPr>
+                <w:rFonts w:ascii="Calibri" w:hAnsi="Calibri" w:cs="Calibri"/>
+              </w:rPr>
+              <w:t>User Stories</w:t>
+            </w:r>
+            <w:r>
+              <w:rPr>
+                <w:rFonts w:ascii="Calibri" w:hAnsi="Calibri" w:cs="Calibri"/>
+              </w:rPr>
+              <w:t xml:space="preserve"> and </w:t>
+            </w:r>
+            <w:r>
+              <w:rPr>
+                <w:rFonts w:ascii="Calibri" w:hAnsi="Calibri" w:cs="Calibri"/>
+              </w:rPr>
+              <w:t>Acceptance Criteria</w:t>
+            </w:r>
+            <w:r>
+              <w:rPr>
+                <w:rFonts w:ascii="Calibri" w:hAnsi="Calibri" w:cs="Calibri"/>
+              </w:rPr>
+              <w:t xml:space="preserve"> (Rally)</w:t>
             </w:r>
           </w:p>
           <w:p>
@@ -2441,22 +3276,61 @@
             <w:r>
               <w:rPr>
                 <w:rFonts w:ascii="Calibri" w:hAnsi="Calibri" w:cs="Calibri"/>
+                <w:b/>
+                <w:bCs w:val="0"/>
                 <w:lang w:val="en-IN"/>
               </w:rPr>
-              <w:t>Strong hold over</w:t>
+              <w:t>Technical</w:t>
             </w:r>
             <w:r>
               <w:rPr>
                 <w:rFonts w:ascii="Calibri" w:hAnsi="Calibri" w:cs="Calibri"/>
                 <w:lang w:val="en-IN"/>
               </w:rPr>
-              <w:t xml:space="preserve"> Linux CLI, </w:t>
+              <w:t xml:space="preserve">: </w:t>
             </w:r>
             <w:r>
               <w:rPr>
                 <w:rFonts w:ascii="Calibri" w:hAnsi="Calibri" w:cs="Calibri"/>
                 <w:lang w:val="en-IN"/>
               </w:rPr>
+              <w:t xml:space="preserve">Python (work experience), C++ (data structures &amp; algorithms), </w:t>
+            </w:r>
+            <w:r>
+              <w:rPr>
+                <w:rFonts w:ascii="Calibri" w:hAnsi="Calibri" w:cs="Calibri"/>
+                <w:lang w:val="en-IN"/>
+              </w:rPr>
+              <w:t xml:space="preserve">Swift (internship), </w:t>
+            </w:r>
+            <w:bookmarkStart w:id="13" w:name="_Hlk164984571"/>
+            <w:r>
+              <w:rPr>
+                <w:rFonts w:ascii="Calibri" w:hAnsi="Calibri" w:cs="Calibri"/>
+                <w:lang w:val="en-IN"/>
+              </w:rPr>
+              <w:t>and Core Java</w:t>
+            </w:r>
+            <w:bookmarkEnd w:id="13"/>
+            <w:r>
+              <w:rPr>
+                <w:rFonts w:ascii="Calibri" w:hAnsi="Calibri" w:cs="Calibri"/>
+                <w:lang w:val="en-IN"/>
+              </w:rPr>
+              <w:t xml:space="preserve">.  Strong hold over </w:t>
+            </w:r>
+            <w:r>
+              <w:rPr>
+                <w:rFonts w:ascii="Calibri" w:hAnsi="Calibri" w:cs="Calibri"/>
+                <w:lang w:val="en-IN"/>
+              </w:rPr>
+              <w:t xml:space="preserve">Linux CLI, </w:t>
+            </w:r>
+            <w:r>
+              <w:rPr>
+                <w:rFonts w:ascii="Calibri" w:hAnsi="Calibri" w:cs="Calibri"/>
+                <w:lang w:val="en-IN"/>
+              </w:rPr>
               <w:t xml:space="preserve">Bash scripting, </w:t>
             </w:r>
             <w:r>
@@ -2513,122 +3387,24 @@
                 <w:rFonts w:ascii="Calibri" w:hAnsi="Calibri" w:cs="Calibri"/>
                 <w:lang w:val="en-IN"/>
               </w:rPr>
-              <w:t xml:space="preserve">. </w:t>
+              <w:t xml:space="preserve">. Familiar with Docker and K8s fundamentals. </w:t>
             </w:r>
             <w:r>
               <w:rPr>
                 <w:rFonts w:ascii="Calibri" w:hAnsi="Calibri" w:cs="Calibri"/>
                 <w:lang w:val="en-IN"/>
               </w:rPr>
-              <w:t xml:space="preserve">Familiar with </w:t>
+              <w:t>Experience with AWS S3, EC2, Lambda, IAM, SES, and Route 53 for personal projects.</w:t>
             </w:r>
             <w:r>
               <w:rPr>
                 <w:rFonts w:ascii="Calibri" w:hAnsi="Calibri" w:cs="Calibri"/>
                 <w:lang w:val="en-IN"/>
               </w:rPr>
-              <w:t>Docker</w:t>
-            </w:r>
-            <w:r>
-              <w:rPr>
-                <w:rFonts w:ascii="Calibri" w:hAnsi="Calibri" w:cs="Calibri"/>
-                <w:lang w:val="en-IN"/>
-              </w:rPr>
-              <w:t xml:space="preserve"> and </w:t>
-            </w:r>
-            <w:r>
-              <w:rPr>
-                <w:rFonts w:ascii="Calibri" w:hAnsi="Calibri" w:cs="Calibri"/>
-                <w:lang w:val="en-IN"/>
-              </w:rPr>
-              <w:t>K8s</w:t>
-            </w:r>
-            <w:r>
-              <w:rPr>
-                <w:rFonts w:ascii="Calibri" w:hAnsi="Calibri" w:cs="Calibri"/>
-                <w:lang w:val="en-IN"/>
-              </w:rPr>
-              <w:t xml:space="preserve"> fundamentals.</w:t>
-            </w:r>
-            <w:r>
-              <w:rPr>
-                <w:rFonts w:ascii="Calibri" w:hAnsi="Calibri" w:cs="Calibri"/>
-                <w:lang w:val="en-IN"/>
-              </w:rPr>
-              <w:t xml:space="preserve"> </w:t>
-            </w:r>
-            <w:r>
-              <w:rPr>
-                <w:rFonts w:ascii="Calibri" w:hAnsi="Calibri" w:cs="Calibri"/>
-                <w:lang w:val="en-IN"/>
-              </w:rPr>
-              <w:t xml:space="preserve">Experience with </w:t>
-            </w:r>
-            <w:r>
-              <w:rPr>
-                <w:rFonts w:ascii="Calibri" w:hAnsi="Calibri" w:cs="Calibri"/>
-                <w:lang w:val="en-IN"/>
-              </w:rPr>
-              <w:t xml:space="preserve">AWS S3, EC2, Lambda, </w:t>
-            </w:r>
-            <w:r>
-              <w:rPr>
-                <w:rFonts w:ascii="Calibri" w:hAnsi="Calibri" w:cs="Calibri"/>
-                <w:lang w:val="en-IN"/>
-              </w:rPr>
-              <w:t xml:space="preserve">IAM, </w:t>
-            </w:r>
-            <w:r>
-              <w:rPr>
-                <w:rFonts w:ascii="Calibri" w:hAnsi="Calibri" w:cs="Calibri"/>
-                <w:lang w:val="en-IN"/>
-              </w:rPr>
-              <w:t xml:space="preserve">SES, </w:t>
-            </w:r>
-            <w:r>
-              <w:rPr>
-                <w:rFonts w:ascii="Calibri" w:hAnsi="Calibri" w:cs="Calibri"/>
-                <w:lang w:val="en-IN"/>
-              </w:rPr>
-              <w:t xml:space="preserve">and </w:t>
-            </w:r>
-            <w:r>
-              <w:rPr>
-                <w:rFonts w:ascii="Calibri" w:hAnsi="Calibri" w:cs="Calibri"/>
-                <w:lang w:val="en-IN"/>
-              </w:rPr>
-              <w:t>Route 53</w:t>
-            </w:r>
-            <w:r>
-              <w:rPr>
-                <w:rFonts w:ascii="Calibri" w:hAnsi="Calibri" w:cs="Calibri"/>
-                <w:lang w:val="en-IN"/>
-              </w:rPr>
-              <w:t xml:space="preserve"> for </w:t>
-            </w:r>
-            <w:r>
-              <w:rPr>
-                <w:rFonts w:ascii="Calibri" w:hAnsi="Calibri" w:cs="Calibri"/>
-                <w:lang w:val="en-IN"/>
-              </w:rPr>
-              <w:t>personal</w:t>
-            </w:r>
-            <w:r>
-              <w:rPr>
-                <w:rFonts w:ascii="Calibri" w:hAnsi="Calibri" w:cs="Calibri"/>
-                <w:lang w:val="en-IN"/>
-              </w:rPr>
-              <w:t xml:space="preserve"> projects</w:t>
-            </w:r>
-            <w:r>
-              <w:rPr>
-                <w:rFonts w:ascii="Calibri" w:hAnsi="Calibri" w:cs="Calibri"/>
-                <w:lang w:val="en-IN"/>
-              </w:rPr>
-              <w:t>.</w:t>
+              <w:br/>
             </w:r>
           </w:p>
-          <w:bookmarkEnd w:id="13"/>
+          <w:bookmarkEnd w:id="12"/>
           <w:p>
             <w:pPr>
               <w:pStyle w:val="Achievement"/>
@@ -2636,7 +3412,7 @@
                 <w:ilvl w:val="0"/>
                 <w:numId w:val="0"/>
               </w:numPr>
-              <w:ind w:left="252"/>
+              <w:ind w:left="252" w:hanging="180"/>
               <w:rPr>
                 <w:rFonts w:ascii="Calibri" w:hAnsi="Calibri" w:cs="Calibri"/>
                 <w:lang w:val="en-IN"/>
@@ -2676,6 +3452,7 @@
                 <w:sz w:val="20"/>
                 <w:szCs w:val="20"/>
               </w:rPr>
+              <w:lastRenderedPageBreak/>
               <w:t>Achievements</w:t>
             </w:r>
           </w:p>
@@ -2848,6 +3625,16 @@
                 <w:szCs w:val="20"/>
               </w:rPr>
             </w:pPr>
+            <w:r>
+              <w:rPr>
+                <w:rFonts w:ascii="Calibri" w:hAnsi="Calibri" w:cs="Calibri"/>
+                <w:b/>
+                <w:smallCaps/>
+                <w:sz w:val="20"/>
+                <w:szCs w:val="20"/>
+              </w:rPr>
+              <w:t xml:space="preserve">Personal </w:t>
+            </w:r>
             <w:r>
               <w:rPr>
                 <w:rFonts w:ascii="Calibri" w:hAnsi="Calibri" w:cs="Calibri"/>
@@ -2888,131 +3675,73 @@
                 <w:szCs w:val="20"/>
               </w:rPr>
             </w:pPr>
-            <w:bookmarkStart w:id="15" w:name="_Hlk158942803"/>
             <w:r>
               <w:rPr>
                 <w:rFonts w:ascii="Calibri" w:hAnsi="Calibri" w:cs="Calibri"/>
                 <w:b/>
-                <w:bCs/>
-                <w:sz w:val="20"/>
-                <w:szCs w:val="20"/>
-              </w:rPr>
-              <w:t xml:space="preserve">Online Presence: </w:t>
-            </w:r>
-            <w:r>
-              <w:rPr>
-                <w:rFonts w:ascii="Calibri" w:hAnsi="Calibri" w:cs="Calibri"/>
-                <w:sz w:val="20"/>
-                <w:szCs w:val="20"/>
-              </w:rPr>
-              <w:t xml:space="preserve">Developed a website at </w:t>
-            </w:r>
-            <w:hyperlink r:id="rId9" w:history="1">
-              <w:r>
-                <w:rPr>
-                  <w:rStyle w:val="Hyperlink"/>
-                  <w:rFonts w:ascii="Calibri" w:hAnsi="Calibri" w:cs="Calibri"/>
-                  <w:sz w:val="20"/>
-                  <w:szCs w:val="20"/>
-                </w:rPr>
-                <w:t>https://harshitjindal.com</w:t>
-              </w:r>
-            </w:hyperlink>
-            <w:r>
-              <w:rPr>
-                <w:rFonts w:ascii="Calibri" w:hAnsi="Calibri" w:cs="Calibri"/>
-                <w:sz w:val="20"/>
-                <w:szCs w:val="20"/>
-              </w:rPr>
-              <w:t xml:space="preserve"> to host static content such as resume, grade sheets, and custom links like </w:t>
-            </w:r>
-            <w:hyperlink r:id="rId10" w:history="1">
-              <w:r>
-                <w:rPr>
-                  <w:rStyle w:val="Hyperlink"/>
-                  <w:rFonts w:ascii="Calibri" w:hAnsi="Calibri" w:cs="Calibri"/>
-                  <w:sz w:val="20"/>
-                  <w:szCs w:val="20"/>
-                </w:rPr>
-                <w:t>https://harshitjindal.com/linkedin</w:t>
-              </w:r>
-            </w:hyperlink>
-            <w:r>
-              <w:rPr>
-                <w:rFonts w:ascii="Calibri" w:hAnsi="Calibri" w:cs="Calibri"/>
-                <w:sz w:val="20"/>
-                <w:szCs w:val="20"/>
-              </w:rPr>
-              <w:t xml:space="preserve"> for easy navigation. Used DNS management to set up a personalized domain name (CNAME) and </w:t>
-            </w:r>
-            <w:hyperlink r:id="rId11" w:history="1">
-              <w:r>
-                <w:rPr>
-                  <w:rStyle w:val="Hyperlink"/>
-                  <w:rFonts w:ascii="Calibri" w:hAnsi="Calibri" w:cs="Calibri"/>
-                  <w:sz w:val="20"/>
-                  <w:szCs w:val="20"/>
-                </w:rPr>
-                <w:t>contact@harshitjindal.com</w:t>
-              </w:r>
-            </w:hyperlink>
-            <w:r>
-              <w:rPr>
-                <w:rFonts w:ascii="Calibri" w:hAnsi="Calibri" w:cs="Calibri"/>
-                <w:sz w:val="20"/>
-                <w:szCs w:val="20"/>
-              </w:rPr>
-              <w:t xml:space="preserve"> (MX records) for both </w:t>
-            </w:r>
-            <w:r>
-              <w:rPr>
-                <w:rFonts w:ascii="Calibri" w:hAnsi="Calibri" w:cs="Calibri"/>
-                <w:sz w:val="20"/>
-                <w:szCs w:val="20"/>
-              </w:rPr>
-              <w:t>inbound</w:t>
-            </w:r>
-            <w:r>
-              <w:rPr>
-                <w:rFonts w:ascii="Calibri" w:hAnsi="Calibri" w:cs="Calibri"/>
-                <w:sz w:val="20"/>
-                <w:szCs w:val="20"/>
-              </w:rPr>
-              <w:t xml:space="preserve"> and </w:t>
-            </w:r>
-            <w:r>
-              <w:rPr>
-                <w:rFonts w:ascii="Calibri" w:hAnsi="Calibri" w:cs="Calibri"/>
-                <w:sz w:val="20"/>
-                <w:szCs w:val="20"/>
-              </w:rPr>
-              <w:t>outbound</w:t>
-            </w:r>
-            <w:r>
-              <w:rPr>
-                <w:rFonts w:ascii="Calibri" w:hAnsi="Calibri" w:cs="Calibri"/>
-                <w:sz w:val="20"/>
-                <w:szCs w:val="20"/>
-              </w:rPr>
-              <w:t xml:space="preserve"> </w:t>
-            </w:r>
-            <w:r>
-              <w:rPr>
-                <w:rFonts w:ascii="Calibri" w:hAnsi="Calibri" w:cs="Calibri"/>
-                <w:sz w:val="20"/>
-                <w:szCs w:val="20"/>
-              </w:rPr>
-              <w:t>emails</w:t>
-            </w:r>
-            <w:r>
-              <w:rPr>
-                <w:rFonts w:ascii="Calibri" w:hAnsi="Calibri" w:cs="Calibri"/>
-                <w:sz w:val="20"/>
-                <w:szCs w:val="20"/>
-              </w:rPr>
-              <w:t>.</w:t>
-            </w:r>
-            <w:bookmarkEnd w:id="15"/>
+                <w:sz w:val="20"/>
+                <w:szCs w:val="20"/>
+              </w:rPr>
+              <w:t xml:space="preserve">Live </w:t>
+            </w:r>
+            <w:r>
+              <w:rPr>
+                <w:rFonts w:ascii="Calibri" w:hAnsi="Calibri" w:cs="Calibri"/>
+                <w:b/>
+                <w:sz w:val="20"/>
+                <w:szCs w:val="20"/>
+              </w:rPr>
+              <w:t>Accident Detection:</w:t>
+            </w:r>
+            <w:r>
+              <w:rPr>
+                <w:rFonts w:ascii="Calibri" w:hAnsi="Calibri" w:cs="Calibri"/>
+                <w:sz w:val="20"/>
+                <w:szCs w:val="20"/>
+              </w:rPr>
+              <w:t xml:space="preserve"> Used transfer learning to train a</w:t>
+            </w:r>
+            <w:r>
+              <w:rPr>
+                <w:rFonts w:ascii="Calibri" w:hAnsi="Calibri" w:cs="Calibri"/>
+                <w:sz w:val="20"/>
+                <w:szCs w:val="20"/>
+              </w:rPr>
+              <w:t>n</w:t>
+            </w:r>
+            <w:r>
+              <w:rPr>
+                <w:rFonts w:ascii="Calibri" w:hAnsi="Calibri" w:cs="Calibri"/>
+                <w:sz w:val="20"/>
+                <w:szCs w:val="20"/>
+              </w:rPr>
+              <w:t xml:space="preserve"> ML</w:t>
+            </w:r>
+            <w:r>
+              <w:rPr>
+                <w:rFonts w:ascii="Calibri" w:hAnsi="Calibri" w:cs="Calibri"/>
+                <w:sz w:val="20"/>
+                <w:szCs w:val="20"/>
+              </w:rPr>
+              <w:t xml:space="preserve"> model capable of processing live video camera feed at traffic intersections to spot road accidents. Secured 3</w:t>
+            </w:r>
+            <w:r>
+              <w:rPr>
+                <w:rFonts w:ascii="Calibri" w:hAnsi="Calibri" w:cs="Calibri"/>
+                <w:sz w:val="20"/>
+                <w:szCs w:val="20"/>
+                <w:vertAlign w:val="superscript"/>
+              </w:rPr>
+              <w:t>rd</w:t>
+            </w:r>
+            <w:r>
+              <w:rPr>
+                <w:rFonts w:ascii="Calibri" w:hAnsi="Calibri" w:cs="Calibri"/>
+                <w:sz w:val="20"/>
+                <w:szCs w:val="20"/>
+              </w:rPr>
+              <w:t xml:space="preserve"> place at OctaHacks Hackathon 2019.</w:t>
+            </w:r>
           </w:p>
           <w:p>
             <w:pPr>
@@ -3125,60 +3854,67 @@
               <w:rPr>
                 <w:rFonts w:ascii="Calibri" w:hAnsi="Calibri" w:cs="Calibri"/>
                 <w:b/>
-                <w:sz w:val="20"/>
-                <w:szCs w:val="20"/>
-              </w:rPr>
-              <w:t xml:space="preserve">Live </w:t>
-            </w:r>
-            <w:r>
-              <w:rPr>
-                <w:rFonts w:ascii="Calibri" w:hAnsi="Calibri" w:cs="Calibri"/>
-                <w:b/>
-                <w:sz w:val="20"/>
-                <w:szCs w:val="20"/>
-              </w:rPr>
-              <w:t>Accident Detection:</w:t>
-            </w:r>
-            <w:r>
-              <w:rPr>
-                <w:rFonts w:ascii="Calibri" w:hAnsi="Calibri" w:cs="Calibri"/>
-                <w:sz w:val="20"/>
-                <w:szCs w:val="20"/>
-              </w:rPr>
-              <w:t xml:space="preserve"> Used transfer learning to train a</w:t>
-            </w:r>
-            <w:r>
-              <w:rPr>
-                <w:rFonts w:ascii="Calibri" w:hAnsi="Calibri" w:cs="Calibri"/>
-                <w:sz w:val="20"/>
-                <w:szCs w:val="20"/>
-              </w:rPr>
-              <w:t xml:space="preserve"> ML</w:t>
-            </w:r>
-            <w:r>
-              <w:rPr>
-                <w:rFonts w:ascii="Calibri" w:hAnsi="Calibri" w:cs="Calibri"/>
-                <w:sz w:val="20"/>
-                <w:szCs w:val="20"/>
-              </w:rPr>
-              <w:t xml:space="preserve"> model capable of processing live video camera feed at traffic intersections to spot road accidents. Secured 3</w:t>
-            </w:r>
-            <w:r>
-              <w:rPr>
-                <w:rFonts w:ascii="Calibri" w:hAnsi="Calibri" w:cs="Calibri"/>
-                <w:sz w:val="20"/>
-                <w:szCs w:val="20"/>
-                <w:vertAlign w:val="superscript"/>
-              </w:rPr>
-              <w:t>rd</w:t>
-            </w:r>
-            <w:r>
-              <w:rPr>
-                <w:rFonts w:ascii="Calibri" w:hAnsi="Calibri" w:cs="Calibri"/>
-                <w:sz w:val="20"/>
-                <w:szCs w:val="20"/>
-              </w:rPr>
-              <w:t xml:space="preserve"> place at OctaHacks Hackathon 2019.</w:t>
+                <w:bCs/>
+                <w:sz w:val="20"/>
+                <w:szCs w:val="20"/>
+              </w:rPr>
+              <w:t>[Brain-Computer Interfacing] Cognitive Neuroscience:</w:t>
+            </w:r>
+            <w:r>
+              <w:rPr>
+                <w:rFonts w:ascii="Calibri" w:hAnsi="Calibri" w:cs="Calibri"/>
+                <w:sz w:val="20"/>
+                <w:szCs w:val="20"/>
+              </w:rPr>
+              <w:t xml:space="preserve"> Wrote </w:t>
+            </w:r>
+            <w:r>
+              <w:rPr>
+                <w:rFonts w:ascii="Calibri" w:hAnsi="Calibri" w:cs="Calibri"/>
+                <w:sz w:val="20"/>
+                <w:szCs w:val="20"/>
+              </w:rPr>
+              <w:t xml:space="preserve">Arduino </w:t>
+            </w:r>
+            <w:r>
+              <w:rPr>
+                <w:rFonts w:ascii="Calibri" w:hAnsi="Calibri" w:cs="Calibri"/>
+                <w:sz w:val="20"/>
+                <w:szCs w:val="20"/>
+              </w:rPr>
+              <w:t>software</w:t>
+            </w:r>
+            <w:r>
+              <w:rPr>
+                <w:rFonts w:ascii="Calibri" w:hAnsi="Calibri" w:cs="Calibri"/>
+                <w:sz w:val="20"/>
+                <w:szCs w:val="20"/>
+              </w:rPr>
+              <w:t xml:space="preserve"> in C</w:t>
+            </w:r>
+            <w:r>
+              <w:rPr>
+                <w:rFonts w:ascii="Calibri" w:hAnsi="Calibri" w:cs="Calibri"/>
+                <w:sz w:val="20"/>
+                <w:szCs w:val="20"/>
+              </w:rPr>
+              <w:t xml:space="preserve"> to detect muscle artifacts in real-time EEG data </w:t>
+            </w:r>
+            <w:r>
+              <w:rPr>
+                <w:rFonts w:ascii="Calibri" w:hAnsi="Calibri" w:cs="Calibri"/>
+                <w:sz w:val="20"/>
+                <w:szCs w:val="20"/>
+              </w:rPr>
+              <w:t xml:space="preserve">collected </w:t>
+            </w:r>
+            <w:r>
+              <w:rPr>
+                <w:rFonts w:ascii="Calibri" w:hAnsi="Calibri" w:cs="Calibri"/>
+                <w:sz w:val="20"/>
+                <w:szCs w:val="20"/>
+              </w:rPr>
+              <w:t>from the NeuroSky MindWave headset, with the potential for upgraded brain mapping by attenuation of the recognized artifacts. It was tested on the Left Frontal Lobe with &gt;95% accuracy.</w:t>
             </w:r>
           </w:p>
           <w:p>
@@ -3206,90 +3942,6 @@
                 <w:sz w:val="20"/>
                 <w:szCs w:val="20"/>
               </w:rPr>
-              <w:t>[Brain-Computer Interfacing] Cognitive Neuroscience:</w:t>
-            </w:r>
-            <w:r>
-              <w:rPr>
-                <w:rFonts w:ascii="Calibri" w:hAnsi="Calibri" w:cs="Calibri"/>
-                <w:sz w:val="20"/>
-                <w:szCs w:val="20"/>
-              </w:rPr>
-              <w:t xml:space="preserve"> Wrote </w:t>
-            </w:r>
-            <w:r>
-              <w:rPr>
-                <w:rFonts w:ascii="Calibri" w:hAnsi="Calibri" w:cs="Calibri"/>
-                <w:sz w:val="20"/>
-                <w:szCs w:val="20"/>
-              </w:rPr>
-              <w:t xml:space="preserve">Arduino </w:t>
-            </w:r>
-            <w:r>
-              <w:rPr>
-                <w:rFonts w:ascii="Calibri" w:hAnsi="Calibri" w:cs="Calibri"/>
-                <w:sz w:val="20"/>
-                <w:szCs w:val="20"/>
-              </w:rPr>
-              <w:t>software</w:t>
-            </w:r>
-            <w:r>
-              <w:rPr>
-                <w:rFonts w:ascii="Calibri" w:hAnsi="Calibri" w:cs="Calibri"/>
-                <w:sz w:val="20"/>
-                <w:szCs w:val="20"/>
-              </w:rPr>
-              <w:t xml:space="preserve"> in C</w:t>
-            </w:r>
-            <w:r>
-              <w:rPr>
-                <w:rFonts w:ascii="Calibri" w:hAnsi="Calibri" w:cs="Calibri"/>
-                <w:sz w:val="20"/>
-                <w:szCs w:val="20"/>
-              </w:rPr>
-              <w:t xml:space="preserve"> to detect muscle artifacts in real-time EEG data </w:t>
-            </w:r>
-            <w:r>
-              <w:rPr>
-                <w:rFonts w:ascii="Calibri" w:hAnsi="Calibri" w:cs="Calibri"/>
-                <w:sz w:val="20"/>
-                <w:szCs w:val="20"/>
-              </w:rPr>
-              <w:t xml:space="preserve">collected </w:t>
-            </w:r>
-            <w:r>
-              <w:rPr>
-                <w:rFonts w:ascii="Calibri" w:hAnsi="Calibri" w:cs="Calibri"/>
-                <w:sz w:val="20"/>
-                <w:szCs w:val="20"/>
-              </w:rPr>
-              <w:t>from the NeuroSky MindWave headset, with the potential for upgraded brain mapping by attenuation of the recognized artifacts. It was tested on the Left Frontal Lobe with &gt;95% accuracy.</w:t>
-            </w:r>
-          </w:p>
-          <w:p>
-            <w:pPr>
-              <w:numPr>
-                <w:ilvl w:val="0"/>
-                <w:numId w:val="7"/>
-              </w:numPr>
-              <w:tabs>
-                <w:tab w:val="clear" w:pos="916"/>
-              </w:tabs>
-              <w:ind w:left="252" w:hanging="180"/>
-              <w:jc w:val="both"/>
-              <w:rPr>
-                <w:rFonts w:ascii="Calibri" w:hAnsi="Calibri" w:cs="Calibri"/>
-                <w:sz w:val="20"/>
-                <w:szCs w:val="20"/>
-              </w:rPr>
-            </w:pPr>
-            <w:r>
-              <w:rPr>
-                <w:rFonts w:ascii="Calibri" w:hAnsi="Calibri" w:cs="Calibri"/>
-                <w:b/>
-                <w:bCs/>
-                <w:sz w:val="20"/>
-                <w:szCs w:val="20"/>
-              </w:rPr>
               <w:t>[iOS Software</w:t>
             </w:r>
             <w:r>
@@ -3396,7 +4048,7 @@
     </w:p>
     <w:sectPr>
       <w:pgSz w:w="11900" w:h="16840"/>
-      <w:pgMar w:top="680" w:right="964" w:bottom="624" w:left="964" w:header="720" w:footer="720" w:gutter="0"/>
+      <w:pgMar w:top="576" w:right="864" w:bottom="576" w:left="864" w:header="720" w:footer="720" w:gutter="0"/>
       <w:cols w:space="720"/>
       <w:docGrid w:linePitch="360"/>
     </w:sectPr>
@@ -3585,6 +4237,304 @@
     </w:lvl>
   </w:abstractNum>
   <w:abstractNum w:abstractNumId="1" w15:restartNumberingAfterBreak="0">
+    <w:nsid w:val="07161734"/>
+    <w:multiLevelType w:val="multilevel"/>
+    <w:tmpl w:val="A212FBD0"/>
+    <w:lvl w:ilvl="0">
+      <w:start w:val="1"/>
+      <w:numFmt w:val="bullet"/>
+      <w:lvlText w:val=""/>
+      <w:lvlJc w:val="left"/>
+      <w:pPr>
+        <w:tabs>
+          <w:tab w:val="num" w:pos="720"/>
+        </w:tabs>
+        <w:ind w:left="720" w:hanging="360"/>
+      </w:pPr>
+      <w:rPr>
+        <w:rFonts w:ascii="Symbol" w:hAnsi="Symbol" w:hint="default"/>
+        <w:sz w:val="20"/>
+      </w:rPr>
+    </w:lvl>
+    <w:lvl w:ilvl="1">
+      <w:start w:val="1"/>
+      <w:numFmt w:val="bullet"/>
+      <w:lvlText w:val="o"/>
+      <w:lvlJc w:val="left"/>
+      <w:pPr>
+        <w:tabs>
+          <w:tab w:val="num" w:pos="1440"/>
+        </w:tabs>
+        <w:ind w:left="1440" w:hanging="360"/>
+      </w:pPr>
+      <w:rPr>
+        <w:rFonts w:ascii="Courier New" w:hAnsi="Courier New" w:hint="default"/>
+        <w:sz w:val="20"/>
+      </w:rPr>
+    </w:lvl>
+    <w:lvl w:ilvl="2" w:tentative="1">
+      <w:start w:val="1"/>
+      <w:numFmt w:val="bullet"/>
+      <w:lvlText w:val=""/>
+      <w:lvlJc w:val="left"/>
+      <w:pPr>
+        <w:tabs>
+          <w:tab w:val="num" w:pos="2160"/>
+        </w:tabs>
+        <w:ind w:left="2160" w:hanging="360"/>
+      </w:pPr>
+      <w:rPr>
+        <w:rFonts w:ascii="Wingdings" w:hAnsi="Wingdings" w:hint="default"/>
+        <w:sz w:val="20"/>
+      </w:rPr>
+    </w:lvl>
+    <w:lvl w:ilvl="3" w:tentative="1">
+      <w:start w:val="1"/>
+      <w:numFmt w:val="bullet"/>
+      <w:lvlText w:val=""/>
+      <w:lvlJc w:val="left"/>
+      <w:pPr>
+        <w:tabs>
+          <w:tab w:val="num" w:pos="2880"/>
+        </w:tabs>
+        <w:ind w:left="2880" w:hanging="360"/>
+      </w:pPr>
+      <w:rPr>
+        <w:rFonts w:ascii="Wingdings" w:hAnsi="Wingdings" w:hint="default"/>
+        <w:sz w:val="20"/>
+      </w:rPr>
+    </w:lvl>
+    <w:lvl w:ilvl="4" w:tentative="1">
+      <w:start w:val="1"/>
+      <w:numFmt w:val="bullet"/>
+      <w:lvlText w:val=""/>
+      <w:lvlJc w:val="left"/>
+      <w:pPr>
+        <w:tabs>
+          <w:tab w:val="num" w:pos="3600"/>
+        </w:tabs>
+        <w:ind w:left="3600" w:hanging="360"/>
+      </w:pPr>
+      <w:rPr>
+        <w:rFonts w:ascii="Wingdings" w:hAnsi="Wingdings" w:hint="default"/>
+        <w:sz w:val="20"/>
+      </w:rPr>
+    </w:lvl>
+    <w:lvl w:ilvl="5" w:tentative="1">
+      <w:start w:val="1"/>
+      <w:numFmt w:val="bullet"/>
+      <w:lvlText w:val=""/>
+      <w:lvlJc w:val="left"/>
+      <w:pPr>
+        <w:tabs>
+          <w:tab w:val="num" w:pos="4320"/>
+        </w:tabs>
+        <w:ind w:left="4320" w:hanging="360"/>
+      </w:pPr>
+      <w:rPr>
+        <w:rFonts w:ascii="Wingdings" w:hAnsi="Wingdings" w:hint="default"/>
+        <w:sz w:val="20"/>
+      </w:rPr>
+    </w:lvl>
+    <w:lvl w:ilvl="6" w:tentative="1">
+      <w:start w:val="1"/>
+      <w:numFmt w:val="bullet"/>
+      <w:lvlText w:val=""/>
+      <w:lvlJc w:val="left"/>
+      <w:pPr>
+        <w:tabs>
+          <w:tab w:val="num" w:pos="5040"/>
+        </w:tabs>
+        <w:ind w:left="5040" w:hanging="360"/>
+      </w:pPr>
+      <w:rPr>
+        <w:rFonts w:ascii="Wingdings" w:hAnsi="Wingdings" w:hint="default"/>
+        <w:sz w:val="20"/>
+      </w:rPr>
+    </w:lvl>
+    <w:lvl w:ilvl="7" w:tentative="1">
+      <w:start w:val="1"/>
+      <w:numFmt w:val="bullet"/>
+      <w:lvlText w:val=""/>
+      <w:lvlJc w:val="left"/>
+      <w:pPr>
+        <w:tabs>
+          <w:tab w:val="num" w:pos="5760"/>
+        </w:tabs>
+        <w:ind w:left="5760" w:hanging="360"/>
+      </w:pPr>
+      <w:rPr>
+        <w:rFonts w:ascii="Wingdings" w:hAnsi="Wingdings" w:hint="default"/>
+        <w:sz w:val="20"/>
+      </w:rPr>
+    </w:lvl>
+    <w:lvl w:ilvl="8" w:tentative="1">
+      <w:start w:val="1"/>
+      <w:numFmt w:val="bullet"/>
+      <w:lvlText w:val=""/>
+      <w:lvlJc w:val="left"/>
+      <w:pPr>
+        <w:tabs>
+          <w:tab w:val="num" w:pos="6480"/>
+        </w:tabs>
+        <w:ind w:left="6480" w:hanging="360"/>
+      </w:pPr>
+      <w:rPr>
+        <w:rFonts w:ascii="Wingdings" w:hAnsi="Wingdings" w:hint="default"/>
+        <w:sz w:val="20"/>
+      </w:rPr>
+    </w:lvl>
+  </w:abstractNum>
+  <w:abstractNum w:abstractNumId="2" w15:restartNumberingAfterBreak="0">
+    <w:nsid w:val="0D0A7CB0"/>
+    <w:multiLevelType w:val="multilevel"/>
+    <w:tmpl w:val="9F26FD50"/>
+    <w:lvl w:ilvl="0">
+      <w:start w:val="1"/>
+      <w:numFmt w:val="bullet"/>
+      <w:lvlText w:val=""/>
+      <w:lvlJc w:val="left"/>
+      <w:pPr>
+        <w:tabs>
+          <w:tab w:val="num" w:pos="720"/>
+        </w:tabs>
+        <w:ind w:left="720" w:hanging="360"/>
+      </w:pPr>
+      <w:rPr>
+        <w:rFonts w:ascii="Symbol" w:hAnsi="Symbol" w:hint="default"/>
+        <w:sz w:val="20"/>
+      </w:rPr>
+    </w:lvl>
+    <w:lvl w:ilvl="1">
+      <w:start w:val="1"/>
+      <w:numFmt w:val="bullet"/>
+      <w:lvlText w:val="o"/>
+      <w:lvlJc w:val="left"/>
+      <w:pPr>
+        <w:tabs>
+          <w:tab w:val="num" w:pos="1440"/>
+        </w:tabs>
+        <w:ind w:left="1440" w:hanging="360"/>
+      </w:pPr>
+      <w:rPr>
+        <w:rFonts w:ascii="Courier New" w:hAnsi="Courier New" w:hint="default"/>
+        <w:sz w:val="20"/>
+      </w:rPr>
+    </w:lvl>
+    <w:lvl w:ilvl="2" w:tentative="1">
+      <w:start w:val="1"/>
+      <w:numFmt w:val="bullet"/>
+      <w:lvlText w:val=""/>
+      <w:lvlJc w:val="left"/>
+      <w:pPr>
+        <w:tabs>
+          <w:tab w:val="num" w:pos="2160"/>
+        </w:tabs>
+        <w:ind w:left="2160" w:hanging="360"/>
+      </w:pPr>
+      <w:rPr>
+        <w:rFonts w:ascii="Wingdings" w:hAnsi="Wingdings" w:hint="default"/>
+        <w:sz w:val="20"/>
+      </w:rPr>
+    </w:lvl>
+    <w:lvl w:ilvl="3" w:tentative="1">
+      <w:start w:val="1"/>
+      <w:numFmt w:val="bullet"/>
+      <w:lvlText w:val=""/>
+      <w:lvlJc w:val="left"/>
+      <w:pPr>
+        <w:tabs>
+          <w:tab w:val="num" w:pos="2880"/>
+        </w:tabs>
+        <w:ind w:left="2880" w:hanging="360"/>
+      </w:pPr>
+      <w:rPr>
+        <w:rFonts w:ascii="Wingdings" w:hAnsi="Wingdings" w:hint="default"/>
+        <w:sz w:val="20"/>
+      </w:rPr>
+    </w:lvl>
+    <w:lvl w:ilvl="4" w:tentative="1">
+      <w:start w:val="1"/>
+      <w:numFmt w:val="bullet"/>
+      <w:lvlText w:val=""/>
+      <w:lvlJc w:val="left"/>
+      <w:pPr>
+        <w:tabs>
+          <w:tab w:val="num" w:pos="3600"/>
+        </w:tabs>
+        <w:ind w:left="3600" w:hanging="360"/>
+      </w:pPr>
+      <w:rPr>
+        <w:rFonts w:ascii="Wingdings" w:hAnsi="Wingdings" w:hint="default"/>
+        <w:sz w:val="20"/>
+      </w:rPr>
+    </w:lvl>
+    <w:lvl w:ilvl="5" w:tentative="1">
+      <w:start w:val="1"/>
+      <w:numFmt w:val="bullet"/>
+      <w:lvlText w:val=""/>
+      <w:lvlJc w:val="left"/>
+      <w:pPr>
+        <w:tabs>
+          <w:tab w:val="num" w:pos="4320"/>
+        </w:tabs>
+        <w:ind w:left="4320" w:hanging="360"/>
+      </w:pPr>
+      <w:rPr>
+        <w:rFonts w:ascii="Wingdings" w:hAnsi="Wingdings" w:hint="default"/>
+        <w:sz w:val="20"/>
+      </w:rPr>
+    </w:lvl>
+    <w:lvl w:ilvl="6" w:tentative="1">
+      <w:start w:val="1"/>
+      <w:numFmt w:val="bullet"/>
+      <w:lvlText w:val=""/>
+      <w:lvlJc w:val="left"/>
+      <w:pPr>
+        <w:tabs>
+          <w:tab w:val="num" w:pos="5040"/>
+        </w:tabs>
+        <w:ind w:left="5040" w:hanging="360"/>
+      </w:pPr>
+      <w:rPr>
+        <w:rFonts w:ascii="Wingdings" w:hAnsi="Wingdings" w:hint="default"/>
+        <w:sz w:val="20"/>
+      </w:rPr>
+    </w:lvl>
+    <w:lvl w:ilvl="7" w:tentative="1">
+      <w:start w:val="1"/>
+      <w:numFmt w:val="bullet"/>
+      <w:lvlText w:val=""/>
+      <w:lvlJc w:val="left"/>
+      <w:pPr>
+        <w:tabs>
+          <w:tab w:val="num" w:pos="5760"/>
+        </w:tabs>
+        <w:ind w:left="5760" w:hanging="360"/>
+      </w:pPr>
+      <w:rPr>
+        <w:rFonts w:ascii="Wingdings" w:hAnsi="Wingdings" w:hint="default"/>
+        <w:sz w:val="20"/>
+      </w:rPr>
+    </w:lvl>
+    <w:lvl w:ilvl="8" w:tentative="1">
+      <w:start w:val="1"/>
+      <w:numFmt w:val="bullet"/>
+      <w:lvlText w:val=""/>
+      <w:lvlJc w:val="left"/>
+      <w:pPr>
+        <w:tabs>
+          <w:tab w:val="num" w:pos="6480"/>
+        </w:tabs>
+        <w:ind w:left="6480" w:hanging="360"/>
+      </w:pPr>
+      <w:rPr>
+        <w:rFonts w:ascii="Wingdings" w:hAnsi="Wingdings" w:hint="default"/>
+        <w:sz w:val="20"/>
+      </w:rPr>
+    </w:lvl>
+  </w:abstractNum>
+  <w:abstractNum w:abstractNumId="3" w15:restartNumberingAfterBreak="0">
     <w:nsid w:val="0EFC0313"/>
     <w:multiLevelType w:val="multilevel"/>
     <w:tmpl w:val="2C040166"/>
@@ -3733,7 +4683,305 @@
       </w:rPr>
     </w:lvl>
   </w:abstractNum>
-  <w:abstractNum w:abstractNumId="2" w15:restartNumberingAfterBreak="0">
+  <w:abstractNum w:abstractNumId="4" w15:restartNumberingAfterBreak="0">
+    <w:nsid w:val="0F530DDE"/>
+    <w:multiLevelType w:val="multilevel"/>
+    <w:tmpl w:val="423EAA02"/>
+    <w:lvl w:ilvl="0">
+      <w:start w:val="1"/>
+      <w:numFmt w:val="bullet"/>
+      <w:lvlText w:val=""/>
+      <w:lvlJc w:val="left"/>
+      <w:pPr>
+        <w:tabs>
+          <w:tab w:val="num" w:pos="720"/>
+        </w:tabs>
+        <w:ind w:left="720" w:hanging="360"/>
+      </w:pPr>
+      <w:rPr>
+        <w:rFonts w:ascii="Symbol" w:hAnsi="Symbol" w:hint="default"/>
+        <w:sz w:val="20"/>
+      </w:rPr>
+    </w:lvl>
+    <w:lvl w:ilvl="1" w:tentative="1">
+      <w:start w:val="1"/>
+      <w:numFmt w:val="bullet"/>
+      <w:lvlText w:val="o"/>
+      <w:lvlJc w:val="left"/>
+      <w:pPr>
+        <w:tabs>
+          <w:tab w:val="num" w:pos="1440"/>
+        </w:tabs>
+        <w:ind w:left="1440" w:hanging="360"/>
+      </w:pPr>
+      <w:rPr>
+        <w:rFonts w:ascii="Courier New" w:hAnsi="Courier New" w:hint="default"/>
+        <w:sz w:val="20"/>
+      </w:rPr>
+    </w:lvl>
+    <w:lvl w:ilvl="2" w:tentative="1">
+      <w:start w:val="1"/>
+      <w:numFmt w:val="bullet"/>
+      <w:lvlText w:val=""/>
+      <w:lvlJc w:val="left"/>
+      <w:pPr>
+        <w:tabs>
+          <w:tab w:val="num" w:pos="2160"/>
+        </w:tabs>
+        <w:ind w:left="2160" w:hanging="360"/>
+      </w:pPr>
+      <w:rPr>
+        <w:rFonts w:ascii="Wingdings" w:hAnsi="Wingdings" w:hint="default"/>
+        <w:sz w:val="20"/>
+      </w:rPr>
+    </w:lvl>
+    <w:lvl w:ilvl="3" w:tentative="1">
+      <w:start w:val="1"/>
+      <w:numFmt w:val="bullet"/>
+      <w:lvlText w:val=""/>
+      <w:lvlJc w:val="left"/>
+      <w:pPr>
+        <w:tabs>
+          <w:tab w:val="num" w:pos="2880"/>
+        </w:tabs>
+        <w:ind w:left="2880" w:hanging="360"/>
+      </w:pPr>
+      <w:rPr>
+        <w:rFonts w:ascii="Wingdings" w:hAnsi="Wingdings" w:hint="default"/>
+        <w:sz w:val="20"/>
+      </w:rPr>
+    </w:lvl>
+    <w:lvl w:ilvl="4" w:tentative="1">
+      <w:start w:val="1"/>
+      <w:numFmt w:val="bullet"/>
+      <w:lvlText w:val=""/>
+      <w:lvlJc w:val="left"/>
+      <w:pPr>
+        <w:tabs>
+          <w:tab w:val="num" w:pos="3600"/>
+        </w:tabs>
+        <w:ind w:left="3600" w:hanging="360"/>
+      </w:pPr>
+      <w:rPr>
+        <w:rFonts w:ascii="Wingdings" w:hAnsi="Wingdings" w:hint="default"/>
+        <w:sz w:val="20"/>
+      </w:rPr>
+    </w:lvl>
+    <w:lvl w:ilvl="5" w:tentative="1">
+      <w:start w:val="1"/>
+      <w:numFmt w:val="bullet"/>
+      <w:lvlText w:val=""/>
+      <w:lvlJc w:val="left"/>
+      <w:pPr>
+        <w:tabs>
+          <w:tab w:val="num" w:pos="4320"/>
+        </w:tabs>
+        <w:ind w:left="4320" w:hanging="360"/>
+      </w:pPr>
+      <w:rPr>
+        <w:rFonts w:ascii="Wingdings" w:hAnsi="Wingdings" w:hint="default"/>
+        <w:sz w:val="20"/>
+      </w:rPr>
+    </w:lvl>
+    <w:lvl w:ilvl="6" w:tentative="1">
+      <w:start w:val="1"/>
+      <w:numFmt w:val="bullet"/>
+      <w:lvlText w:val=""/>
+      <w:lvlJc w:val="left"/>
+      <w:pPr>
+        <w:tabs>
+          <w:tab w:val="num" w:pos="5040"/>
+        </w:tabs>
+        <w:ind w:left="5040" w:hanging="360"/>
+      </w:pPr>
+      <w:rPr>
+        <w:rFonts w:ascii="Wingdings" w:hAnsi="Wingdings" w:hint="default"/>
+        <w:sz w:val="20"/>
+      </w:rPr>
+    </w:lvl>
+    <w:lvl w:ilvl="7" w:tentative="1">
+      <w:start w:val="1"/>
+      <w:numFmt w:val="bullet"/>
+      <w:lvlText w:val=""/>
+      <w:lvlJc w:val="left"/>
+      <w:pPr>
+        <w:tabs>
+          <w:tab w:val="num" w:pos="5760"/>
+        </w:tabs>
+        <w:ind w:left="5760" w:hanging="360"/>
+      </w:pPr>
+      <w:rPr>
+        <w:rFonts w:ascii="Wingdings" w:hAnsi="Wingdings" w:hint="default"/>
+        <w:sz w:val="20"/>
+      </w:rPr>
+    </w:lvl>
+    <w:lvl w:ilvl="8" w:tentative="1">
+      <w:start w:val="1"/>
+      <w:numFmt w:val="bullet"/>
+      <w:lvlText w:val=""/>
+      <w:lvlJc w:val="left"/>
+      <w:pPr>
+        <w:tabs>
+          <w:tab w:val="num" w:pos="6480"/>
+        </w:tabs>
+        <w:ind w:left="6480" w:hanging="360"/>
+      </w:pPr>
+      <w:rPr>
+        <w:rFonts w:ascii="Wingdings" w:hAnsi="Wingdings" w:hint="default"/>
+        <w:sz w:val="20"/>
+      </w:rPr>
+    </w:lvl>
+  </w:abstractNum>
+  <w:abstractNum w:abstractNumId="5" w15:restartNumberingAfterBreak="0">
+    <w:nsid w:val="149D1032"/>
+    <w:multiLevelType w:val="multilevel"/>
+    <w:tmpl w:val="E104E716"/>
+    <w:lvl w:ilvl="0">
+      <w:start w:val="1"/>
+      <w:numFmt w:val="bullet"/>
+      <w:lvlText w:val=""/>
+      <w:lvlJc w:val="left"/>
+      <w:pPr>
+        <w:tabs>
+          <w:tab w:val="num" w:pos="720"/>
+        </w:tabs>
+        <w:ind w:left="720" w:hanging="360"/>
+      </w:pPr>
+      <w:rPr>
+        <w:rFonts w:ascii="Symbol" w:hAnsi="Symbol" w:hint="default"/>
+        <w:sz w:val="20"/>
+      </w:rPr>
+    </w:lvl>
+    <w:lvl w:ilvl="1" w:tentative="1">
+      <w:start w:val="1"/>
+      <w:numFmt w:val="bullet"/>
+      <w:lvlText w:val="o"/>
+      <w:lvlJc w:val="left"/>
+      <w:pPr>
+        <w:tabs>
+          <w:tab w:val="num" w:pos="1440"/>
+        </w:tabs>
+        <w:ind w:left="1440" w:hanging="360"/>
+      </w:pPr>
+      <w:rPr>
+        <w:rFonts w:ascii="Courier New" w:hAnsi="Courier New" w:hint="default"/>
+        <w:sz w:val="20"/>
+      </w:rPr>
+    </w:lvl>
+    <w:lvl w:ilvl="2" w:tentative="1">
+      <w:start w:val="1"/>
+      <w:numFmt w:val="bullet"/>
+      <w:lvlText w:val=""/>
+      <w:lvlJc w:val="left"/>
+      <w:pPr>
+        <w:tabs>
+          <w:tab w:val="num" w:pos="2160"/>
+        </w:tabs>
+        <w:ind w:left="2160" w:hanging="360"/>
+      </w:pPr>
+      <w:rPr>
+        <w:rFonts w:ascii="Wingdings" w:hAnsi="Wingdings" w:hint="default"/>
+        <w:sz w:val="20"/>
+      </w:rPr>
+    </w:lvl>
+    <w:lvl w:ilvl="3" w:tentative="1">
+      <w:start w:val="1"/>
+      <w:numFmt w:val="bullet"/>
+      <w:lvlText w:val=""/>
+      <w:lvlJc w:val="left"/>
+      <w:pPr>
+        <w:tabs>
+          <w:tab w:val="num" w:pos="2880"/>
+        </w:tabs>
+        <w:ind w:left="2880" w:hanging="360"/>
+      </w:pPr>
+      <w:rPr>
+        <w:rFonts w:ascii="Wingdings" w:hAnsi="Wingdings" w:hint="default"/>
+        <w:sz w:val="20"/>
+      </w:rPr>
+    </w:lvl>
+    <w:lvl w:ilvl="4" w:tentative="1">
+      <w:start w:val="1"/>
+      <w:numFmt w:val="bullet"/>
+      <w:lvlText w:val=""/>
+      <w:lvlJc w:val="left"/>
+      <w:pPr>
+        <w:tabs>
+          <w:tab w:val="num" w:pos="3600"/>
+        </w:tabs>
+        <w:ind w:left="3600" w:hanging="360"/>
+      </w:pPr>
+      <w:rPr>
+        <w:rFonts w:ascii="Wingdings" w:hAnsi="Wingdings" w:hint="default"/>
+        <w:sz w:val="20"/>
+      </w:rPr>
+    </w:lvl>
+    <w:lvl w:ilvl="5" w:tentative="1">
+      <w:start w:val="1"/>
+      <w:numFmt w:val="bullet"/>
+      <w:lvlText w:val=""/>
+      <w:lvlJc w:val="left"/>
+      <w:pPr>
+        <w:tabs>
+          <w:tab w:val="num" w:pos="4320"/>
+        </w:tabs>
+        <w:ind w:left="4320" w:hanging="360"/>
+      </w:pPr>
+      <w:rPr>
+        <w:rFonts w:ascii="Wingdings" w:hAnsi="Wingdings" w:hint="default"/>
+        <w:sz w:val="20"/>
+      </w:rPr>
+    </w:lvl>
+    <w:lvl w:ilvl="6" w:tentative="1">
+      <w:start w:val="1"/>
+      <w:numFmt w:val="bullet"/>
+      <w:lvlText w:val=""/>
+      <w:lvlJc w:val="left"/>
+      <w:pPr>
+        <w:tabs>
+          <w:tab w:val="num" w:pos="5040"/>
+        </w:tabs>
+        <w:ind w:left="5040" w:hanging="360"/>
+      </w:pPr>
+      <w:rPr>
+        <w:rFonts w:ascii="Wingdings" w:hAnsi="Wingdings" w:hint="default"/>
+        <w:sz w:val="20"/>
+      </w:rPr>
+    </w:lvl>
+    <w:lvl w:ilvl="7" w:tentative="1">
+      <w:start w:val="1"/>
+      <w:numFmt w:val="bullet"/>
+      <w:lvlText w:val=""/>
+      <w:lvlJc w:val="left"/>
+      <w:pPr>
+        <w:tabs>
+          <w:tab w:val="num" w:pos="5760"/>
+        </w:tabs>
+        <w:ind w:left="5760" w:hanging="360"/>
+      </w:pPr>
+      <w:rPr>
+        <w:rFonts w:ascii="Wingdings" w:hAnsi="Wingdings" w:hint="default"/>
+        <w:sz w:val="20"/>
+      </w:rPr>
+    </w:lvl>
+    <w:lvl w:ilvl="8" w:tentative="1">
+      <w:start w:val="1"/>
+      <w:numFmt w:val="bullet"/>
+      <w:lvlText w:val=""/>
+      <w:lvlJc w:val="left"/>
+      <w:pPr>
+        <w:tabs>
+          <w:tab w:val="num" w:pos="6480"/>
+        </w:tabs>
+        <w:ind w:left="6480" w:hanging="360"/>
+      </w:pPr>
+      <w:rPr>
+        <w:rFonts w:ascii="Wingdings" w:hAnsi="Wingdings" w:hint="default"/>
+        <w:sz w:val="20"/>
+      </w:rPr>
+    </w:lvl>
+  </w:abstractNum>
+  <w:abstractNum w:abstractNumId="6" w15:restartNumberingAfterBreak="0">
     <w:nsid w:val="20C727DB"/>
     <w:multiLevelType w:val="hybridMultilevel"/>
     <w:tmpl w:val="58C8715E"/>
@@ -3846,7 +5094,7 @@
       </w:rPr>
     </w:lvl>
   </w:abstractNum>
-  <w:abstractNum w:abstractNumId="3" w15:restartNumberingAfterBreak="0">
+  <w:abstractNum w:abstractNumId="7" w15:restartNumberingAfterBreak="0">
     <w:nsid w:val="218D459C"/>
     <w:multiLevelType w:val="hybridMultilevel"/>
     <w:tmpl w:val="1A6E3490"/>
@@ -3959,7 +5207,7 @@
       </w:rPr>
     </w:lvl>
   </w:abstractNum>
-  <w:abstractNum w:abstractNumId="4" w15:restartNumberingAfterBreak="0">
+  <w:abstractNum w:abstractNumId="8" w15:restartNumberingAfterBreak="0">
     <w:nsid w:val="28C36D3A"/>
     <w:multiLevelType w:val="hybridMultilevel"/>
     <w:tmpl w:val="17462E32"/>
@@ -4102,7 +5350,7 @@
       </w:rPr>
     </w:lvl>
   </w:abstractNum>
-  <w:abstractNum w:abstractNumId="5" w15:restartNumberingAfterBreak="0">
+  <w:abstractNum w:abstractNumId="9" w15:restartNumberingAfterBreak="0">
     <w:nsid w:val="2A525042"/>
     <w:multiLevelType w:val="hybridMultilevel"/>
     <w:tmpl w:val="972E6B8C"/>
@@ -4215,7 +5463,7 @@
       </w:rPr>
     </w:lvl>
   </w:abstractNum>
-  <w:abstractNum w:abstractNumId="6" w15:restartNumberingAfterBreak="0">
+  <w:abstractNum w:abstractNumId="10" w15:restartNumberingAfterBreak="0">
     <w:nsid w:val="37E50D79"/>
     <w:multiLevelType w:val="multilevel"/>
     <w:tmpl w:val="0F56C60A"/>
@@ -4364,7 +5612,156 @@
       </w:rPr>
     </w:lvl>
   </w:abstractNum>
-  <w:abstractNum w:abstractNumId="7" w15:restartNumberingAfterBreak="0">
+  <w:abstractNum w:abstractNumId="11" w15:restartNumberingAfterBreak="0">
+    <w:nsid w:val="401F25F0"/>
+    <w:multiLevelType w:val="multilevel"/>
+    <w:tmpl w:val="4C5CD55A"/>
+    <w:lvl w:ilvl="0">
+      <w:start w:val="1"/>
+      <w:numFmt w:val="bullet"/>
+      <w:lvlText w:val=""/>
+      <w:lvlJc w:val="left"/>
+      <w:pPr>
+        <w:tabs>
+          <w:tab w:val="num" w:pos="720"/>
+        </w:tabs>
+        <w:ind w:left="720" w:hanging="360"/>
+      </w:pPr>
+      <w:rPr>
+        <w:rFonts w:ascii="Symbol" w:hAnsi="Symbol" w:hint="default"/>
+        <w:sz w:val="20"/>
+      </w:rPr>
+    </w:lvl>
+    <w:lvl w:ilvl="1">
+      <w:start w:val="1"/>
+      <w:numFmt w:val="bullet"/>
+      <w:lvlText w:val="o"/>
+      <w:lvlJc w:val="left"/>
+      <w:pPr>
+        <w:tabs>
+          <w:tab w:val="num" w:pos="1440"/>
+        </w:tabs>
+        <w:ind w:left="1440" w:hanging="360"/>
+      </w:pPr>
+      <w:rPr>
+        <w:rFonts w:ascii="Courier New" w:hAnsi="Courier New" w:hint="default"/>
+        <w:sz w:val="20"/>
+      </w:rPr>
+    </w:lvl>
+    <w:lvl w:ilvl="2" w:tentative="1">
+      <w:start w:val="1"/>
+      <w:numFmt w:val="bullet"/>
+      <w:lvlText w:val=""/>
+      <w:lvlJc w:val="left"/>
+      <w:pPr>
+        <w:tabs>
+          <w:tab w:val="num" w:pos="2160"/>
+        </w:tabs>
+        <w:ind w:left="2160" w:hanging="360"/>
+      </w:pPr>
+      <w:rPr>
+        <w:rFonts w:ascii="Wingdings" w:hAnsi="Wingdings" w:hint="default"/>
+        <w:sz w:val="20"/>
+      </w:rPr>
+    </w:lvl>
+    <w:lvl w:ilvl="3" w:tentative="1">
+      <w:start w:val="1"/>
+      <w:numFmt w:val="bullet"/>
+      <w:lvlText w:val=""/>
+      <w:lvlJc w:val="left"/>
+      <w:pPr>
+        <w:tabs>
+          <w:tab w:val="num" w:pos="2880"/>
+        </w:tabs>
+        <w:ind w:left="2880" w:hanging="360"/>
+      </w:pPr>
+      <w:rPr>
+        <w:rFonts w:ascii="Wingdings" w:hAnsi="Wingdings" w:hint="default"/>
+        <w:sz w:val="20"/>
+      </w:rPr>
+    </w:lvl>
+    <w:lvl w:ilvl="4" w:tentative="1">
+      <w:start w:val="1"/>
+      <w:numFmt w:val="bullet"/>
+      <w:lvlText w:val=""/>
+      <w:lvlJc w:val="left"/>
+      <w:pPr>
+        <w:tabs>
+          <w:tab w:val="num" w:pos="3600"/>
+        </w:tabs>
+        <w:ind w:left="3600" w:hanging="360"/>
+      </w:pPr>
+      <w:rPr>
+        <w:rFonts w:ascii="Wingdings" w:hAnsi="Wingdings" w:hint="default"/>
+        <w:sz w:val="20"/>
+      </w:rPr>
+    </w:lvl>
+    <w:lvl w:ilvl="5" w:tentative="1">
+      <w:start w:val="1"/>
+      <w:numFmt w:val="bullet"/>
+      <w:lvlText w:val=""/>
+      <w:lvlJc w:val="left"/>
+      <w:pPr>
+        <w:tabs>
+          <w:tab w:val="num" w:pos="4320"/>
+        </w:tabs>
+        <w:ind w:left="4320" w:hanging="360"/>
+      </w:pPr>
+      <w:rPr>
+        <w:rFonts w:ascii="Wingdings" w:hAnsi="Wingdings" w:hint="default"/>
+        <w:sz w:val="20"/>
+      </w:rPr>
+    </w:lvl>
+    <w:lvl w:ilvl="6" w:tentative="1">
+      <w:start w:val="1"/>
+      <w:numFmt w:val="bullet"/>
+      <w:lvlText w:val=""/>
+      <w:lvlJc w:val="left"/>
+      <w:pPr>
+        <w:tabs>
+          <w:tab w:val="num" w:pos="5040"/>
+        </w:tabs>
+        <w:ind w:left="5040" w:hanging="360"/>
+      </w:pPr>
+      <w:rPr>
+        <w:rFonts w:ascii="Wingdings" w:hAnsi="Wingdings" w:hint="default"/>
+        <w:sz w:val="20"/>
+      </w:rPr>
+    </w:lvl>
+    <w:lvl w:ilvl="7" w:tentative="1">
+      <w:start w:val="1"/>
+      <w:numFmt w:val="bullet"/>
+      <w:lvlText w:val=""/>
+      <w:lvlJc w:val="left"/>
+      <w:pPr>
+        <w:tabs>
+          <w:tab w:val="num" w:pos="5760"/>
+        </w:tabs>
+        <w:ind w:left="5760" w:hanging="360"/>
+      </w:pPr>
+      <w:rPr>
+        <w:rFonts w:ascii="Wingdings" w:hAnsi="Wingdings" w:hint="default"/>
+        <w:sz w:val="20"/>
+      </w:rPr>
+    </w:lvl>
+    <w:lvl w:ilvl="8" w:tentative="1">
+      <w:start w:val="1"/>
+      <w:numFmt w:val="bullet"/>
+      <w:lvlText w:val=""/>
+      <w:lvlJc w:val="left"/>
+      <w:pPr>
+        <w:tabs>
+          <w:tab w:val="num" w:pos="6480"/>
+        </w:tabs>
+        <w:ind w:left="6480" w:hanging="360"/>
+      </w:pPr>
+      <w:rPr>
+        <w:rFonts w:ascii="Wingdings" w:hAnsi="Wingdings" w:hint="default"/>
+        <w:sz w:val="20"/>
+      </w:rPr>
+    </w:lvl>
+  </w:abstractNum>
+  <w:abstractNum w:abstractNumId="12" w15:restartNumberingAfterBreak="0">
     <w:nsid w:val="43EE3875"/>
     <w:multiLevelType w:val="hybridMultilevel"/>
     <w:tmpl w:val="1F2409AA"/>
@@ -4507,7 +5904,7 @@
       </w:rPr>
     </w:lvl>
   </w:abstractNum>
-  <w:abstractNum w:abstractNumId="8" w15:restartNumberingAfterBreak="0">
+  <w:abstractNum w:abstractNumId="13" w15:restartNumberingAfterBreak="0">
     <w:nsid w:val="44E36D24"/>
     <w:multiLevelType w:val="multilevel"/>
     <w:tmpl w:val="C574A1D4"/>
@@ -4650,7 +6047,7 @@
       </w:rPr>
     </w:lvl>
   </w:abstractNum>
-  <w:abstractNum w:abstractNumId="9" w15:restartNumberingAfterBreak="0">
+  <w:abstractNum w:abstractNumId="14" w15:restartNumberingAfterBreak="0">
     <w:nsid w:val="4EA55D92"/>
     <w:multiLevelType w:val="hybridMultilevel"/>
     <w:tmpl w:val="40F8EF08"/>
@@ -4794,7 +6191,7 @@
       </w:rPr>
     </w:lvl>
   </w:abstractNum>
-  <w:abstractNum w:abstractNumId="10" w15:restartNumberingAfterBreak="0">
+  <w:abstractNum w:abstractNumId="15" w15:restartNumberingAfterBreak="0">
     <w:nsid w:val="59D62AF9"/>
     <w:multiLevelType w:val="hybridMultilevel"/>
     <w:tmpl w:val="B0DC66D8"/>
@@ -4907,7 +6304,7 @@
       </w:rPr>
     </w:lvl>
   </w:abstractNum>
-  <w:abstractNum w:abstractNumId="11" w15:restartNumberingAfterBreak="0">
+  <w:abstractNum w:abstractNumId="16" w15:restartNumberingAfterBreak="0">
     <w:nsid w:val="602376DE"/>
     <w:multiLevelType w:val="multilevel"/>
     <w:tmpl w:val="1F2409AA"/>
@@ -5050,7 +6447,156 @@
       </w:rPr>
     </w:lvl>
   </w:abstractNum>
-  <w:abstractNum w:abstractNumId="12" w15:restartNumberingAfterBreak="0">
+  <w:abstractNum w:abstractNumId="17" w15:restartNumberingAfterBreak="0">
+    <w:nsid w:val="626E501F"/>
+    <w:multiLevelType w:val="multilevel"/>
+    <w:tmpl w:val="07A48BD0"/>
+    <w:lvl w:ilvl="0">
+      <w:start w:val="1"/>
+      <w:numFmt w:val="bullet"/>
+      <w:lvlText w:val=""/>
+      <w:lvlJc w:val="left"/>
+      <w:pPr>
+        <w:tabs>
+          <w:tab w:val="num" w:pos="720"/>
+        </w:tabs>
+        <w:ind w:left="720" w:hanging="360"/>
+      </w:pPr>
+      <w:rPr>
+        <w:rFonts w:ascii="Symbol" w:hAnsi="Symbol" w:hint="default"/>
+        <w:sz w:val="20"/>
+      </w:rPr>
+    </w:lvl>
+    <w:lvl w:ilvl="1">
+      <w:start w:val="1"/>
+      <w:numFmt w:val="bullet"/>
+      <w:lvlText w:val="o"/>
+      <w:lvlJc w:val="left"/>
+      <w:pPr>
+        <w:tabs>
+          <w:tab w:val="num" w:pos="1440"/>
+        </w:tabs>
+        <w:ind w:left="1440" w:hanging="360"/>
+      </w:pPr>
+      <w:rPr>
+        <w:rFonts w:ascii="Courier New" w:hAnsi="Courier New" w:hint="default"/>
+        <w:sz w:val="20"/>
+      </w:rPr>
+    </w:lvl>
+    <w:lvl w:ilvl="2" w:tentative="1">
+      <w:start w:val="1"/>
+      <w:numFmt w:val="bullet"/>
+      <w:lvlText w:val=""/>
+      <w:lvlJc w:val="left"/>
+      <w:pPr>
+        <w:tabs>
+          <w:tab w:val="num" w:pos="2160"/>
+        </w:tabs>
+        <w:ind w:left="2160" w:hanging="360"/>
+      </w:pPr>
+      <w:rPr>
+        <w:rFonts w:ascii="Wingdings" w:hAnsi="Wingdings" w:hint="default"/>
+        <w:sz w:val="20"/>
+      </w:rPr>
+    </w:lvl>
+    <w:lvl w:ilvl="3" w:tentative="1">
+      <w:start w:val="1"/>
+      <w:numFmt w:val="bullet"/>
+      <w:lvlText w:val=""/>
+      <w:lvlJc w:val="left"/>
+      <w:pPr>
+        <w:tabs>
+          <w:tab w:val="num" w:pos="2880"/>
+        </w:tabs>
+        <w:ind w:left="2880" w:hanging="360"/>
+      </w:pPr>
+      <w:rPr>
+        <w:rFonts w:ascii="Wingdings" w:hAnsi="Wingdings" w:hint="default"/>
+        <w:sz w:val="20"/>
+      </w:rPr>
+    </w:lvl>
+    <w:lvl w:ilvl="4" w:tentative="1">
+      <w:start w:val="1"/>
+      <w:numFmt w:val="bullet"/>
+      <w:lvlText w:val=""/>
+      <w:lvlJc w:val="left"/>
+      <w:pPr>
+        <w:tabs>
+          <w:tab w:val="num" w:pos="3600"/>
+        </w:tabs>
+        <w:ind w:left="3600" w:hanging="360"/>
+      </w:pPr>
+      <w:rPr>
+        <w:rFonts w:ascii="Wingdings" w:hAnsi="Wingdings" w:hint="default"/>
+        <w:sz w:val="20"/>
+      </w:rPr>
+    </w:lvl>
+    <w:lvl w:ilvl="5" w:tentative="1">
+      <w:start w:val="1"/>
+      <w:numFmt w:val="bullet"/>
+      <w:lvlText w:val=""/>
+      <w:lvlJc w:val="left"/>
+      <w:pPr>
+        <w:tabs>
+          <w:tab w:val="num" w:pos="4320"/>
+        </w:tabs>
+        <w:ind w:left="4320" w:hanging="360"/>
+      </w:pPr>
+      <w:rPr>
+        <w:rFonts w:ascii="Wingdings" w:hAnsi="Wingdings" w:hint="default"/>
+        <w:sz w:val="20"/>
+      </w:rPr>
+    </w:lvl>
+    <w:lvl w:ilvl="6" w:tentative="1">
+      <w:start w:val="1"/>
+      <w:numFmt w:val="bullet"/>
+      <w:lvlText w:val=""/>
+      <w:lvlJc w:val="left"/>
+      <w:pPr>
+        <w:tabs>
+          <w:tab w:val="num" w:pos="5040"/>
+        </w:tabs>
+        <w:ind w:left="5040" w:hanging="360"/>
+      </w:pPr>
+      <w:rPr>
+        <w:rFonts w:ascii="Wingdings" w:hAnsi="Wingdings" w:hint="default"/>
+        <w:sz w:val="20"/>
+      </w:rPr>
+    </w:lvl>
+    <w:lvl w:ilvl="7" w:tentative="1">
+      <w:start w:val="1"/>
+      <w:numFmt w:val="bullet"/>
+      <w:lvlText w:val=""/>
+      <w:lvlJc w:val="left"/>
+      <w:pPr>
+        <w:tabs>
+          <w:tab w:val="num" w:pos="5760"/>
+        </w:tabs>
+        <w:ind w:left="5760" w:hanging="360"/>
+      </w:pPr>
+      <w:rPr>
+        <w:rFonts w:ascii="Wingdings" w:hAnsi="Wingdings" w:hint="default"/>
+        <w:sz w:val="20"/>
+      </w:rPr>
+    </w:lvl>
+    <w:lvl w:ilvl="8" w:tentative="1">
+      <w:start w:val="1"/>
+      <w:numFmt w:val="bullet"/>
+      <w:lvlText w:val=""/>
+      <w:lvlJc w:val="left"/>
+      <w:pPr>
+        <w:tabs>
+          <w:tab w:val="num" w:pos="6480"/>
+        </w:tabs>
+        <w:ind w:left="6480" w:hanging="360"/>
+      </w:pPr>
+      <w:rPr>
+        <w:rFonts w:ascii="Wingdings" w:hAnsi="Wingdings" w:hint="default"/>
+        <w:sz w:val="20"/>
+      </w:rPr>
+    </w:lvl>
+  </w:abstractNum>
+  <w:abstractNum w:abstractNumId="18" w15:restartNumberingAfterBreak="0">
     <w:nsid w:val="664F2126"/>
     <w:multiLevelType w:val="hybridMultilevel"/>
     <w:tmpl w:val="DE1EB572"/>
@@ -5163,7 +6709,7 @@
       </w:rPr>
     </w:lvl>
   </w:abstractNum>
-  <w:abstractNum w:abstractNumId="13" w15:restartNumberingAfterBreak="0">
+  <w:abstractNum w:abstractNumId="19" w15:restartNumberingAfterBreak="0">
     <w:nsid w:val="66BE4B9C"/>
     <w:multiLevelType w:val="hybridMultilevel"/>
     <w:tmpl w:val="C574A1D4"/>
@@ -5306,7 +6852,7 @@
       </w:rPr>
     </w:lvl>
   </w:abstractNum>
-  <w:abstractNum w:abstractNumId="14" w15:restartNumberingAfterBreak="0">
+  <w:abstractNum w:abstractNumId="20" w15:restartNumberingAfterBreak="0">
     <w:nsid w:val="6C8E594D"/>
     <w:multiLevelType w:val="hybridMultilevel"/>
     <w:tmpl w:val="4FF2909A"/>
@@ -5449,7 +6995,305 @@
       </w:rPr>
     </w:lvl>
   </w:abstractNum>
-  <w:abstractNum w:abstractNumId="15" w15:restartNumberingAfterBreak="0">
+  <w:abstractNum w:abstractNumId="21" w15:restartNumberingAfterBreak="0">
+    <w:nsid w:val="6E063B4E"/>
+    <w:multiLevelType w:val="multilevel"/>
+    <w:tmpl w:val="B0264002"/>
+    <w:lvl w:ilvl="0">
+      <w:start w:val="1"/>
+      <w:numFmt w:val="bullet"/>
+      <w:lvlText w:val=""/>
+      <w:lvlJc w:val="left"/>
+      <w:pPr>
+        <w:tabs>
+          <w:tab w:val="num" w:pos="720"/>
+        </w:tabs>
+        <w:ind w:left="720" w:hanging="360"/>
+      </w:pPr>
+      <w:rPr>
+        <w:rFonts w:ascii="Symbol" w:hAnsi="Symbol" w:hint="default"/>
+        <w:sz w:val="20"/>
+      </w:rPr>
+    </w:lvl>
+    <w:lvl w:ilvl="1" w:tentative="1">
+      <w:start w:val="1"/>
+      <w:numFmt w:val="bullet"/>
+      <w:lvlText w:val="o"/>
+      <w:lvlJc w:val="left"/>
+      <w:pPr>
+        <w:tabs>
+          <w:tab w:val="num" w:pos="1440"/>
+        </w:tabs>
+        <w:ind w:left="1440" w:hanging="360"/>
+      </w:pPr>
+      <w:rPr>
+        <w:rFonts w:ascii="Courier New" w:hAnsi="Courier New" w:hint="default"/>
+        <w:sz w:val="20"/>
+      </w:rPr>
+    </w:lvl>
+    <w:lvl w:ilvl="2" w:tentative="1">
+      <w:start w:val="1"/>
+      <w:numFmt w:val="bullet"/>
+      <w:lvlText w:val=""/>
+      <w:lvlJc w:val="left"/>
+      <w:pPr>
+        <w:tabs>
+          <w:tab w:val="num" w:pos="2160"/>
+        </w:tabs>
+        <w:ind w:left="2160" w:hanging="360"/>
+      </w:pPr>
+      <w:rPr>
+        <w:rFonts w:ascii="Wingdings" w:hAnsi="Wingdings" w:hint="default"/>
+        <w:sz w:val="20"/>
+      </w:rPr>
+    </w:lvl>
+    <w:lvl w:ilvl="3" w:tentative="1">
+      <w:start w:val="1"/>
+      <w:numFmt w:val="bullet"/>
+      <w:lvlText w:val=""/>
+      <w:lvlJc w:val="left"/>
+      <w:pPr>
+        <w:tabs>
+          <w:tab w:val="num" w:pos="2880"/>
+        </w:tabs>
+        <w:ind w:left="2880" w:hanging="360"/>
+      </w:pPr>
+      <w:rPr>
+        <w:rFonts w:ascii="Wingdings" w:hAnsi="Wingdings" w:hint="default"/>
+        <w:sz w:val="20"/>
+      </w:rPr>
+    </w:lvl>
+    <w:lvl w:ilvl="4" w:tentative="1">
+      <w:start w:val="1"/>
+      <w:numFmt w:val="bullet"/>
+      <w:lvlText w:val=""/>
+      <w:lvlJc w:val="left"/>
+      <w:pPr>
+        <w:tabs>
+          <w:tab w:val="num" w:pos="3600"/>
+        </w:tabs>
+        <w:ind w:left="3600" w:hanging="360"/>
+      </w:pPr>
+      <w:rPr>
+        <w:rFonts w:ascii="Wingdings" w:hAnsi="Wingdings" w:hint="default"/>
+        <w:sz w:val="20"/>
+      </w:rPr>
+    </w:lvl>
+    <w:lvl w:ilvl="5" w:tentative="1">
+      <w:start w:val="1"/>
+      <w:numFmt w:val="bullet"/>
+      <w:lvlText w:val=""/>
+      <w:lvlJc w:val="left"/>
+      <w:pPr>
+        <w:tabs>
+          <w:tab w:val="num" w:pos="4320"/>
+        </w:tabs>
+        <w:ind w:left="4320" w:hanging="360"/>
+      </w:pPr>
+      <w:rPr>
+        <w:rFonts w:ascii="Wingdings" w:hAnsi="Wingdings" w:hint="default"/>
+        <w:sz w:val="20"/>
+      </w:rPr>
+    </w:lvl>
+    <w:lvl w:ilvl="6" w:tentative="1">
+      <w:start w:val="1"/>
+      <w:numFmt w:val="bullet"/>
+      <w:lvlText w:val=""/>
+      <w:lvlJc w:val="left"/>
+      <w:pPr>
+        <w:tabs>
+          <w:tab w:val="num" w:pos="5040"/>
+        </w:tabs>
+        <w:ind w:left="5040" w:hanging="360"/>
+      </w:pPr>
+      <w:rPr>
+        <w:rFonts w:ascii="Wingdings" w:hAnsi="Wingdings" w:hint="default"/>
+        <w:sz w:val="20"/>
+      </w:rPr>
+    </w:lvl>
+    <w:lvl w:ilvl="7" w:tentative="1">
+      <w:start w:val="1"/>
+      <w:numFmt w:val="bullet"/>
+      <w:lvlText w:val=""/>
+      <w:lvlJc w:val="left"/>
+      <w:pPr>
+        <w:tabs>
+          <w:tab w:val="num" w:pos="5760"/>
+        </w:tabs>
+        <w:ind w:left="5760" w:hanging="360"/>
+      </w:pPr>
+      <w:rPr>
+        <w:rFonts w:ascii="Wingdings" w:hAnsi="Wingdings" w:hint="default"/>
+        <w:sz w:val="20"/>
+      </w:rPr>
+    </w:lvl>
+    <w:lvl w:ilvl="8" w:tentative="1">
+      <w:start w:val="1"/>
+      <w:numFmt w:val="bullet"/>
+      <w:lvlText w:val=""/>
+      <w:lvlJc w:val="left"/>
+      <w:pPr>
+        <w:tabs>
+          <w:tab w:val="num" w:pos="6480"/>
+        </w:tabs>
+        <w:ind w:left="6480" w:hanging="360"/>
+      </w:pPr>
+      <w:rPr>
+        <w:rFonts w:ascii="Wingdings" w:hAnsi="Wingdings" w:hint="default"/>
+        <w:sz w:val="20"/>
+      </w:rPr>
+    </w:lvl>
+  </w:abstractNum>
+  <w:abstractNum w:abstractNumId="22" w15:restartNumberingAfterBreak="0">
+    <w:nsid w:val="72B37E2A"/>
+    <w:multiLevelType w:val="multilevel"/>
+    <w:tmpl w:val="DAD23520"/>
+    <w:lvl w:ilvl="0">
+      <w:start w:val="1"/>
+      <w:numFmt w:val="bullet"/>
+      <w:lvlText w:val=""/>
+      <w:lvlJc w:val="left"/>
+      <w:pPr>
+        <w:tabs>
+          <w:tab w:val="num" w:pos="720"/>
+        </w:tabs>
+        <w:ind w:left="720" w:hanging="360"/>
+      </w:pPr>
+      <w:rPr>
+        <w:rFonts w:ascii="Symbol" w:hAnsi="Symbol" w:hint="default"/>
+        <w:sz w:val="20"/>
+      </w:rPr>
+    </w:lvl>
+    <w:lvl w:ilvl="1">
+      <w:start w:val="1"/>
+      <w:numFmt w:val="bullet"/>
+      <w:lvlText w:val="o"/>
+      <w:lvlJc w:val="left"/>
+      <w:pPr>
+        <w:tabs>
+          <w:tab w:val="num" w:pos="1440"/>
+        </w:tabs>
+        <w:ind w:left="1440" w:hanging="360"/>
+      </w:pPr>
+      <w:rPr>
+        <w:rFonts w:ascii="Courier New" w:hAnsi="Courier New" w:hint="default"/>
+        <w:sz w:val="20"/>
+      </w:rPr>
+    </w:lvl>
+    <w:lvl w:ilvl="2" w:tentative="1">
+      <w:start w:val="1"/>
+      <w:numFmt w:val="bullet"/>
+      <w:lvlText w:val=""/>
+      <w:lvlJc w:val="left"/>
+      <w:pPr>
+        <w:tabs>
+          <w:tab w:val="num" w:pos="2160"/>
+        </w:tabs>
+        <w:ind w:left="2160" w:hanging="360"/>
+      </w:pPr>
+      <w:rPr>
+        <w:rFonts w:ascii="Wingdings" w:hAnsi="Wingdings" w:hint="default"/>
+        <w:sz w:val="20"/>
+      </w:rPr>
+    </w:lvl>
+    <w:lvl w:ilvl="3" w:tentative="1">
+      <w:start w:val="1"/>
+      <w:numFmt w:val="bullet"/>
+      <w:lvlText w:val=""/>
+      <w:lvlJc w:val="left"/>
+      <w:pPr>
+        <w:tabs>
+          <w:tab w:val="num" w:pos="2880"/>
+        </w:tabs>
+        <w:ind w:left="2880" w:hanging="360"/>
+      </w:pPr>
+      <w:rPr>
+        <w:rFonts w:ascii="Wingdings" w:hAnsi="Wingdings" w:hint="default"/>
+        <w:sz w:val="20"/>
+      </w:rPr>
+    </w:lvl>
+    <w:lvl w:ilvl="4" w:tentative="1">
+      <w:start w:val="1"/>
+      <w:numFmt w:val="bullet"/>
+      <w:lvlText w:val=""/>
+      <w:lvlJc w:val="left"/>
+      <w:pPr>
+        <w:tabs>
+          <w:tab w:val="num" w:pos="3600"/>
+        </w:tabs>
+        <w:ind w:left="3600" w:hanging="360"/>
+      </w:pPr>
+      <w:rPr>
+        <w:rFonts w:ascii="Wingdings" w:hAnsi="Wingdings" w:hint="default"/>
+        <w:sz w:val="20"/>
+      </w:rPr>
+    </w:lvl>
+    <w:lvl w:ilvl="5" w:tentative="1">
+      <w:start w:val="1"/>
+      <w:numFmt w:val="bullet"/>
+      <w:lvlText w:val=""/>
+      <w:lvlJc w:val="left"/>
+      <w:pPr>
+        <w:tabs>
+          <w:tab w:val="num" w:pos="4320"/>
+        </w:tabs>
+        <w:ind w:left="4320" w:hanging="360"/>
+      </w:pPr>
+      <w:rPr>
+        <w:rFonts w:ascii="Wingdings" w:hAnsi="Wingdings" w:hint="default"/>
+        <w:sz w:val="20"/>
+      </w:rPr>
+    </w:lvl>
+    <w:lvl w:ilvl="6" w:tentative="1">
+      <w:start w:val="1"/>
+      <w:numFmt w:val="bullet"/>
+      <w:lvlText w:val=""/>
+      <w:lvlJc w:val="left"/>
+      <w:pPr>
+        <w:tabs>
+          <w:tab w:val="num" w:pos="5040"/>
+        </w:tabs>
+        <w:ind w:left="5040" w:hanging="360"/>
+      </w:pPr>
+      <w:rPr>
+        <w:rFonts w:ascii="Wingdings" w:hAnsi="Wingdings" w:hint="default"/>
+        <w:sz w:val="20"/>
+      </w:rPr>
+    </w:lvl>
+    <w:lvl w:ilvl="7" w:tentative="1">
+      <w:start w:val="1"/>
+      <w:numFmt w:val="bullet"/>
+      <w:lvlText w:val=""/>
+      <w:lvlJc w:val="left"/>
+      <w:pPr>
+        <w:tabs>
+          <w:tab w:val="num" w:pos="5760"/>
+        </w:tabs>
+        <w:ind w:left="5760" w:hanging="360"/>
+      </w:pPr>
+      <w:rPr>
+        <w:rFonts w:ascii="Wingdings" w:hAnsi="Wingdings" w:hint="default"/>
+        <w:sz w:val="20"/>
+      </w:rPr>
+    </w:lvl>
+    <w:lvl w:ilvl="8" w:tentative="1">
+      <w:start w:val="1"/>
+      <w:numFmt w:val="bullet"/>
+      <w:lvlText w:val=""/>
+      <w:lvlJc w:val="left"/>
+      <w:pPr>
+        <w:tabs>
+          <w:tab w:val="num" w:pos="6480"/>
+        </w:tabs>
+        <w:ind w:left="6480" w:hanging="360"/>
+      </w:pPr>
+      <w:rPr>
+        <w:rFonts w:ascii="Wingdings" w:hAnsi="Wingdings" w:hint="default"/>
+        <w:sz w:val="20"/>
+      </w:rPr>
+    </w:lvl>
+  </w:abstractNum>
+  <w:abstractNum w:abstractNumId="23" w15:restartNumberingAfterBreak="0">
     <w:nsid w:val="73054A62"/>
     <w:multiLevelType w:val="hybridMultilevel"/>
     <w:tmpl w:val="ABB00A48"/>
@@ -5589,7 +7433,7 @@
       </w:rPr>
     </w:lvl>
   </w:abstractNum>
-  <w:abstractNum w:abstractNumId="16" w15:restartNumberingAfterBreak="0">
+  <w:abstractNum w:abstractNumId="24" w15:restartNumberingAfterBreak="0">
     <w:nsid w:val="7D8828E0"/>
     <w:multiLevelType w:val="hybridMultilevel"/>
     <w:tmpl w:val="B68CC4E6"/>
@@ -5733,55 +7577,79 @@
     </w:lvl>
   </w:abstractNum>
   <w:num w:numId="1" w16cid:durableId="174345982">
-    <w:abstractNumId w:val="7"/>
+    <w:abstractNumId w:val="12"/>
   </w:num>
   <w:num w:numId="2" w16cid:durableId="576591569">
-    <w:abstractNumId w:val="4"/>
+    <w:abstractNumId w:val="8"/>
   </w:num>
   <w:num w:numId="3" w16cid:durableId="1964455288">
-    <w:abstractNumId w:val="9"/>
+    <w:abstractNumId w:val="14"/>
   </w:num>
   <w:num w:numId="4" w16cid:durableId="1809740008">
+    <w:abstractNumId w:val="24"/>
+  </w:num>
+  <w:num w:numId="5" w16cid:durableId="1663850123">
+    <w:abstractNumId w:val="19"/>
+  </w:num>
+  <w:num w:numId="6" w16cid:durableId="1726873998">
+    <w:abstractNumId w:val="23"/>
+  </w:num>
+  <w:num w:numId="7" w16cid:durableId="1737628104">
+    <w:abstractNumId w:val="20"/>
+  </w:num>
+  <w:num w:numId="8" w16cid:durableId="824591776">
     <w:abstractNumId w:val="16"/>
   </w:num>
-  <w:num w:numId="5" w16cid:durableId="1663850123">
+  <w:num w:numId="9" w16cid:durableId="1081562466">
     <w:abstractNumId w:val="13"/>
-  </w:num>
-  <w:num w:numId="6" w16cid:durableId="1726873998">
-    <w:abstractNumId w:val="15"/>
-  </w:num>
-  <w:num w:numId="7" w16cid:durableId="1737628104">
-    <w:abstractNumId w:val="14"/>
-  </w:num>
-  <w:num w:numId="8" w16cid:durableId="824591776">
-    <w:abstractNumId w:val="11"/>
-  </w:num>
-  <w:num w:numId="9" w16cid:durableId="1081562466">
-    <w:abstractNumId w:val="8"/>
   </w:num>
   <w:num w:numId="10" w16cid:durableId="666596524">
     <w:abstractNumId w:val="0"/>
   </w:num>
   <w:num w:numId="11" w16cid:durableId="910847414">
-    <w:abstractNumId w:val="12"/>
+    <w:abstractNumId w:val="18"/>
   </w:num>
   <w:num w:numId="12" w16cid:durableId="1205286574">
+    <w:abstractNumId w:val="9"/>
+  </w:num>
+  <w:num w:numId="13" w16cid:durableId="469830577">
+    <w:abstractNumId w:val="6"/>
+  </w:num>
+  <w:num w:numId="14" w16cid:durableId="219052901">
+    <w:abstractNumId w:val="10"/>
+  </w:num>
+  <w:num w:numId="15" w16cid:durableId="942687552">
+    <w:abstractNumId w:val="7"/>
+  </w:num>
+  <w:num w:numId="16" w16cid:durableId="329216700">
+    <w:abstractNumId w:val="15"/>
+  </w:num>
+  <w:num w:numId="17" w16cid:durableId="1901332060">
+    <w:abstractNumId w:val="3"/>
+  </w:num>
+  <w:num w:numId="18" w16cid:durableId="1253704566">
+    <w:abstractNumId w:val="4"/>
+  </w:num>
+  <w:num w:numId="19" w16cid:durableId="556554481">
+    <w:abstractNumId w:val="17"/>
+  </w:num>
+  <w:num w:numId="20" w16cid:durableId="263346220">
+    <w:abstractNumId w:val="21"/>
+  </w:num>
+  <w:num w:numId="21" w16cid:durableId="1162349692">
+    <w:abstractNumId w:val="2"/>
+  </w:num>
+  <w:num w:numId="22" w16cid:durableId="732890865">
+    <w:abstractNumId w:val="22"/>
+  </w:num>
+  <w:num w:numId="23" w16cid:durableId="1921989397">
+    <w:abstractNumId w:val="1"/>
+  </w:num>
+  <w:num w:numId="24" w16cid:durableId="1811554516">
     <w:abstractNumId w:val="5"/>
   </w:num>
-  <w:num w:numId="13" w16cid:durableId="469830577">
-    <w:abstractNumId w:val="2"/>
-  </w:num>
-  <w:num w:numId="14" w16cid:durableId="219052901">
-    <w:abstractNumId w:val="6"/>
-  </w:num>
-  <w:num w:numId="15" w16cid:durableId="942687552">
-    <w:abstractNumId w:val="3"/>
-  </w:num>
-  <w:num w:numId="16" w16cid:durableId="329216700">
-    <w:abstractNumId w:val="10"/>
-  </w:num>
-  <w:num w:numId="17" w16cid:durableId="1901332060">
-    <w:abstractNumId w:val="1"/>
+  <w:num w:numId="25" w16cid:durableId="1072696524">
+    <w:abstractNumId w:val="11"/>
   </w:num>
 </w:numbering>
 </file>
@@ -6081,7 +7949,7 @@
   <w:style w:type="paragraph" w:default="1" w:styleId="Normal">
     <w:name w:val="Normal"/>
     <w:qFormat/>
-    <w:rsid w:val="00D2779A"/>
+    <w:rsid w:val="00587DD6"/>
     <w:rPr>
       <w:sz w:val="24"/>
       <w:szCs w:val="24"/>
@@ -6199,7 +8067,6 @@
   <w:style w:type="character" w:default="1" w:styleId="DefaultParagraphFont">
     <w:name w:val="Default Paragraph Font"/>
     <w:uiPriority w:val="1"/>
-    <w:semiHidden/>
     <w:unhideWhenUsed/>
   </w:style>
   <w:style w:type="table" w:default="1" w:styleId="TableNormal">

</xml_diff>